<commit_message>
Anotaciones Jair Entrega 4
</commit_message>
<xml_diff>
--- a/documentación/Documentación Base de Datos To-BE.docx
+++ b/documentación/Documentación Base de Datos To-BE.docx
@@ -110,34 +110,13 @@
     <w:p>
       <w:pPr>
         <w:pStyle w:val="Prrafodelista"/>
-        <w:numPr>
-          <w:ilvl w:val="0"/>
-          <w:numId w:val="2"/>
-        </w:numPr>
         <w:spacing w:after="200" w:line="276" w:lineRule="auto"/>
-        <w:rPr>
-          <w:rFonts w:ascii="Arial" w:hAnsi="Arial" w:cs="Arial"/>
-          <w:sz w:val="24"/>
-          <w:szCs w:val="24"/>
-        </w:rPr>
-      </w:pPr>
-      <w:r>
-        <w:rPr>
-          <w:rFonts w:ascii="Arial" w:hAnsi="Arial" w:cs="Arial"/>
-          <w:sz w:val="24"/>
-          <w:szCs w:val="24"/>
-        </w:rPr>
-        <w:t>Se le asigno al servidor, inicialmente, una memoria máxima de 8 GB.</w:t>
-      </w:r>
-    </w:p>
-    <w:p>
-      <w:pPr>
-        <w:pStyle w:val="Prrafodelista"/>
-        <w:spacing w:after="200" w:line="276" w:lineRule="auto"/>
-        <w:rPr>
-          <w:rFonts w:ascii="Arial" w:hAnsi="Arial" w:cs="Arial"/>
-          <w:sz w:val="24"/>
-          <w:szCs w:val="24"/>
+        <w:ind w:left="1440"/>
+        <w:rPr>
+          <w:rFonts w:ascii="Arial" w:hAnsi="Arial" w:cs="Arial"/>
+          <w:sz w:val="24"/>
+          <w:szCs w:val="24"/>
+          <w:lang w:val="en-US"/>
         </w:rPr>
       </w:pPr>
     </w:p>
@@ -158,23 +137,41 @@
       <w:r>
         <w:rPr>
           <w:rFonts w:ascii="Arial" w:hAnsi="Arial" w:cs="Arial"/>
-          <w:sz w:val="24"/>
-          <w:szCs w:val="24"/>
-        </w:rPr>
-        <w:t>Se configuro la base de datos temporal con un tamaño inicial de 8 MB, y con un máximo de 64 MB.</w:t>
-      </w:r>
-    </w:p>
-    <w:p>
-      <w:pPr>
-        <w:pStyle w:val="Prrafodelista"/>
-        <w:spacing w:after="200" w:line="276" w:lineRule="auto"/>
-        <w:rPr>
-          <w:rFonts w:ascii="Arial" w:hAnsi="Arial" w:cs="Arial"/>
-          <w:sz w:val="24"/>
-          <w:szCs w:val="24"/>
-          <w:u w:val="single"/>
-        </w:rPr>
-      </w:pPr>
+          <w:b/>
+          <w:bCs/>
+          <w:sz w:val="24"/>
+          <w:szCs w:val="24"/>
+        </w:rPr>
+        <w:t xml:space="preserve">Ubicación del </w:t>
+      </w:r>
+      <w:r>
+        <w:rPr>
+          <w:rFonts w:ascii="Arial" w:hAnsi="Arial" w:cs="Arial"/>
+          <w:b/>
+          <w:bCs/>
+          <w:sz w:val="24"/>
+          <w:szCs w:val="24"/>
+        </w:rPr>
+        <w:t>motor de base de datos</w:t>
+      </w:r>
+      <w:r>
+        <w:rPr>
+          <w:rFonts w:ascii="Arial" w:hAnsi="Arial" w:cs="Arial"/>
+          <w:b/>
+          <w:bCs/>
+          <w:sz w:val="24"/>
+          <w:szCs w:val="24"/>
+        </w:rPr>
+        <w:t>:</w:t>
+      </w:r>
+      <w:r>
+        <w:rPr>
+          <w:rFonts w:ascii="Arial" w:hAnsi="Arial" w:cs="Arial"/>
+          <w:sz w:val="24"/>
+          <w:szCs w:val="24"/>
+        </w:rPr>
+        <w:t xml:space="preserve"> “C:\Program Files\Microsoft SQL Server”.</w:t>
+      </w:r>
     </w:p>
     <w:p>
       <w:pPr>
@@ -188,63 +185,37 @@
           <w:rFonts w:ascii="Arial" w:hAnsi="Arial" w:cs="Arial"/>
           <w:sz w:val="24"/>
           <w:szCs w:val="24"/>
-        </w:rPr>
-      </w:pPr>
-      <w:r>
-        <w:rPr>
-          <w:rFonts w:ascii="Arial" w:hAnsi="Arial" w:cs="Arial"/>
-          <w:b/>
-          <w:bCs/>
-          <w:sz w:val="24"/>
-          <w:szCs w:val="24"/>
-        </w:rPr>
-        <w:t xml:space="preserve">Ubicación del </w:t>
-      </w:r>
-      <w:r>
-        <w:rPr>
-          <w:rFonts w:ascii="Arial" w:hAnsi="Arial" w:cs="Arial"/>
-          <w:b/>
-          <w:bCs/>
-          <w:sz w:val="24"/>
-          <w:szCs w:val="24"/>
-        </w:rPr>
-        <w:t>motor de base de datos</w:t>
-      </w:r>
-      <w:r>
-        <w:rPr>
-          <w:rFonts w:ascii="Arial" w:hAnsi="Arial" w:cs="Arial"/>
-          <w:b/>
-          <w:bCs/>
-          <w:sz w:val="24"/>
-          <w:szCs w:val="24"/>
-        </w:rPr>
-        <w:t>:</w:t>
-      </w:r>
-      <w:r>
-        <w:rPr>
-          <w:rFonts w:ascii="Arial" w:hAnsi="Arial" w:cs="Arial"/>
-          <w:sz w:val="24"/>
-          <w:szCs w:val="24"/>
-        </w:rPr>
-        <w:t xml:space="preserve"> “C:\</w:t>
-      </w:r>
-      <w:proofErr w:type="spellStart"/>
-      <w:r>
-        <w:rPr>
-          <w:rFonts w:ascii="Arial" w:hAnsi="Arial" w:cs="Arial"/>
-          <w:sz w:val="24"/>
-          <w:szCs w:val="24"/>
-        </w:rPr>
-        <w:t>Program</w:t>
-      </w:r>
-      <w:proofErr w:type="spellEnd"/>
-      <w:r>
-        <w:rPr>
-          <w:rFonts w:ascii="Arial" w:hAnsi="Arial" w:cs="Arial"/>
-          <w:sz w:val="24"/>
-          <w:szCs w:val="24"/>
-        </w:rPr>
-        <w:t xml:space="preserve"> Files\Microsoft SQL Server”.</w:t>
+          <w:lang w:val="en-US"/>
+        </w:rPr>
+      </w:pPr>
+      <w:r>
+        <w:rPr>
+          <w:rFonts w:ascii="Arial" w:hAnsi="Arial" w:cs="Arial"/>
+          <w:b/>
+          <w:bCs/>
+          <w:sz w:val="24"/>
+          <w:szCs w:val="24"/>
+          <w:lang w:val="en-US"/>
+        </w:rPr>
+        <w:t>Ubicación del datafile:</w:t>
+      </w:r>
+      <w:r>
+        <w:rPr>
+          <w:rFonts w:ascii="Arial" w:hAnsi="Arial" w:cs="Arial"/>
+          <w:sz w:val="24"/>
+          <w:szCs w:val="24"/>
+          <w:lang w:val="en-US"/>
+        </w:rPr>
+        <w:t xml:space="preserve"> “C:\Program Files\Microsoft SQL Server\MSSQL16.SQLEXPRESS\MSSQL\DATA”</w:t>
+      </w:r>
+      <w:r>
+        <w:rPr>
+          <w:rFonts w:ascii="Arial" w:hAnsi="Arial" w:cs="Arial"/>
+          <w:sz w:val="24"/>
+          <w:szCs w:val="24"/>
+          <w:lang w:val="en-US"/>
+        </w:rPr>
+        <w:t>.</w:t>
       </w:r>
     </w:p>
     <w:p>
@@ -259,61 +230,23 @@
           <w:rFonts w:ascii="Arial" w:hAnsi="Arial" w:cs="Arial"/>
           <w:sz w:val="24"/>
           <w:szCs w:val="24"/>
-          <w:lang w:val="en-US"/>
-        </w:rPr>
-      </w:pPr>
-      <w:proofErr w:type="spellStart"/>
-      <w:r>
-        <w:rPr>
-          <w:rFonts w:ascii="Arial" w:hAnsi="Arial" w:cs="Arial"/>
-          <w:b/>
-          <w:bCs/>
-          <w:sz w:val="24"/>
-          <w:szCs w:val="24"/>
-          <w:lang w:val="en-US"/>
-        </w:rPr>
-        <w:t>Ubicación</w:t>
-      </w:r>
-      <w:proofErr w:type="spellEnd"/>
-      <w:r>
-        <w:rPr>
-          <w:rFonts w:ascii="Arial" w:hAnsi="Arial" w:cs="Arial"/>
-          <w:b/>
-          <w:bCs/>
-          <w:sz w:val="24"/>
-          <w:szCs w:val="24"/>
-          <w:lang w:val="en-US"/>
-        </w:rPr>
-        <w:t xml:space="preserve"> del d</w:t>
-      </w:r>
-      <w:r>
-        <w:rPr>
-          <w:rFonts w:ascii="Arial" w:hAnsi="Arial" w:cs="Arial"/>
-          <w:b/>
-          <w:bCs/>
-          <w:sz w:val="24"/>
-          <w:szCs w:val="24"/>
-          <w:lang w:val="en-US"/>
-        </w:rPr>
-        <w:t>atafile</w:t>
-      </w:r>
-      <w:r>
-        <w:rPr>
-          <w:rFonts w:ascii="Arial" w:hAnsi="Arial" w:cs="Arial"/>
-          <w:b/>
-          <w:bCs/>
-          <w:sz w:val="24"/>
-          <w:szCs w:val="24"/>
-          <w:lang w:val="en-US"/>
-        </w:rPr>
-        <w:t>:</w:t>
-      </w:r>
-      <w:r>
-        <w:rPr>
-          <w:rFonts w:ascii="Arial" w:hAnsi="Arial" w:cs="Arial"/>
-          <w:sz w:val="24"/>
-          <w:szCs w:val="24"/>
-          <w:lang w:val="en-US"/>
+        </w:rPr>
+      </w:pPr>
+      <w:r>
+        <w:rPr>
+          <w:rFonts w:ascii="Arial" w:hAnsi="Arial" w:cs="Arial"/>
+          <w:b/>
+          <w:bCs/>
+          <w:sz w:val="24"/>
+          <w:szCs w:val="24"/>
+        </w:rPr>
+        <w:t>Nombre del archivo de datafile:</w:t>
+      </w:r>
+      <w:r>
+        <w:rPr>
+          <w:rFonts w:ascii="Arial" w:hAnsi="Arial" w:cs="Arial"/>
+          <w:sz w:val="24"/>
+          <w:szCs w:val="24"/>
         </w:rPr>
         <w:t xml:space="preserve"> </w:t>
       </w:r>
@@ -322,7 +255,6 @@
           <w:rFonts w:ascii="Arial" w:hAnsi="Arial" w:cs="Arial"/>
           <w:sz w:val="24"/>
           <w:szCs w:val="24"/>
-          <w:lang w:val="en-US"/>
         </w:rPr>
         <w:t>“</w:t>
       </w:r>
@@ -331,27 +263,16 @@
           <w:rFonts w:ascii="Arial" w:hAnsi="Arial" w:cs="Arial"/>
           <w:sz w:val="24"/>
           <w:szCs w:val="24"/>
-          <w:lang w:val="en-US"/>
-        </w:rPr>
-        <w:t>C:\Program Files\Microsoft SQL Server\MSSQL16.SQLEXPRESS\MSSQL\DATA</w:t>
-      </w:r>
-      <w:r>
-        <w:rPr>
-          <w:rFonts w:ascii="Arial" w:hAnsi="Arial" w:cs="Arial"/>
-          <w:sz w:val="24"/>
-          <w:szCs w:val="24"/>
-          <w:lang w:val="en-US"/>
+        </w:rPr>
+        <w:t>ToBE.md</w:t>
+      </w:r>
+      <w:r>
+        <w:rPr>
+          <w:rFonts w:ascii="Arial" w:hAnsi="Arial" w:cs="Arial"/>
+          <w:sz w:val="24"/>
+          <w:szCs w:val="24"/>
         </w:rPr>
         <w:t>”</w:t>
-      </w:r>
-      <w:r>
-        <w:rPr>
-          <w:rFonts w:ascii="Arial" w:hAnsi="Arial" w:cs="Arial"/>
-          <w:sz w:val="24"/>
-          <w:szCs w:val="24"/>
-          <w:lang w:val="en-US"/>
-        </w:rPr>
-        <w:t>.</w:t>
       </w:r>
     </w:p>
     <w:p>
@@ -376,61 +297,15 @@
           <w:sz w:val="24"/>
           <w:szCs w:val="24"/>
         </w:rPr>
-        <w:t xml:space="preserve">Nombre del archivo de </w:t>
-      </w:r>
-      <w:proofErr w:type="spellStart"/>
-      <w:r>
-        <w:rPr>
-          <w:rFonts w:ascii="Arial" w:hAnsi="Arial" w:cs="Arial"/>
-          <w:b/>
-          <w:bCs/>
-          <w:sz w:val="24"/>
-          <w:szCs w:val="24"/>
-        </w:rPr>
-        <w:t>datafile</w:t>
-      </w:r>
-      <w:proofErr w:type="spellEnd"/>
-      <w:r>
-        <w:rPr>
-          <w:rFonts w:ascii="Arial" w:hAnsi="Arial" w:cs="Arial"/>
-          <w:b/>
-          <w:bCs/>
-          <w:sz w:val="24"/>
-          <w:szCs w:val="24"/>
-        </w:rPr>
-        <w:t>:</w:t>
-      </w:r>
-      <w:r>
-        <w:rPr>
-          <w:rFonts w:ascii="Arial" w:hAnsi="Arial" w:cs="Arial"/>
-          <w:sz w:val="24"/>
-          <w:szCs w:val="24"/>
-        </w:rPr>
-        <w:t xml:space="preserve"> </w:t>
-      </w:r>
-      <w:r>
-        <w:rPr>
-          <w:rFonts w:ascii="Arial" w:hAnsi="Arial" w:cs="Arial"/>
-          <w:sz w:val="24"/>
-          <w:szCs w:val="24"/>
-        </w:rPr>
-        <w:t>“</w:t>
-      </w:r>
-      <w:r>
-        <w:rPr>
-          <w:rFonts w:ascii="Arial" w:hAnsi="Arial" w:cs="Arial"/>
-          <w:sz w:val="24"/>
-          <w:szCs w:val="24"/>
-        </w:rPr>
-        <w:t>ToBE.md</w:t>
-      </w:r>
-      <w:r>
-        <w:rPr>
-          <w:rFonts w:ascii="Arial" w:hAnsi="Arial" w:cs="Arial"/>
-          <w:sz w:val="24"/>
-          <w:szCs w:val="24"/>
-        </w:rPr>
-        <w:t>”</w:t>
+        <w:t>Ubicación de los registros (logs):</w:t>
+      </w:r>
+      <w:r>
+        <w:rPr>
+          <w:rFonts w:ascii="Arial" w:hAnsi="Arial" w:cs="Arial"/>
+          <w:sz w:val="24"/>
+          <w:szCs w:val="24"/>
+        </w:rPr>
+        <w:t xml:space="preserve"> “C:\Program Files\Microsoft SQL Server\MSSQL16.SQLEXPRESS\MSSQL\DATA”.</w:t>
       </w:r>
     </w:p>
     <w:p>
@@ -455,33 +330,31 @@
           <w:sz w:val="24"/>
           <w:szCs w:val="24"/>
         </w:rPr>
-        <w:t>Ubicación de los registros (logs):</w:t>
-      </w:r>
-      <w:r>
-        <w:rPr>
-          <w:rFonts w:ascii="Arial" w:hAnsi="Arial" w:cs="Arial"/>
-          <w:sz w:val="24"/>
-          <w:szCs w:val="24"/>
-        </w:rPr>
-        <w:t xml:space="preserve"> “C:\</w:t>
-      </w:r>
-      <w:proofErr w:type="spellStart"/>
-      <w:r>
-        <w:rPr>
-          <w:rFonts w:ascii="Arial" w:hAnsi="Arial" w:cs="Arial"/>
-          <w:sz w:val="24"/>
-          <w:szCs w:val="24"/>
-        </w:rPr>
-        <w:t>Program</w:t>
-      </w:r>
-      <w:proofErr w:type="spellEnd"/>
-      <w:r>
-        <w:rPr>
-          <w:rFonts w:ascii="Arial" w:hAnsi="Arial" w:cs="Arial"/>
-          <w:sz w:val="24"/>
-          <w:szCs w:val="24"/>
-        </w:rPr>
-        <w:t xml:space="preserve"> Files\Microsoft SQL Server\MSSQL16.SQLEXPRESS\MSSQL\DATA”.</w:t>
+        <w:t>Nombre del archivo de logs:</w:t>
+      </w:r>
+      <w:r>
+        <w:rPr>
+          <w:rFonts w:ascii="Arial" w:hAnsi="Arial" w:cs="Arial"/>
+          <w:sz w:val="24"/>
+          <w:szCs w:val="24"/>
+        </w:rPr>
+        <w:t xml:space="preserve"> “</w:t>
+      </w:r>
+      <w:r>
+        <w:rPr>
+          <w:rFonts w:ascii="Arial" w:hAnsi="Arial" w:cs="Arial"/>
+          <w:sz w:val="24"/>
+          <w:szCs w:val="24"/>
+        </w:rPr>
+        <w:t>ToBE_log.ldf</w:t>
+      </w:r>
+      <w:r>
+        <w:rPr>
+          <w:rFonts w:ascii="Arial" w:hAnsi="Arial" w:cs="Arial"/>
+          <w:sz w:val="24"/>
+          <w:szCs w:val="24"/>
+        </w:rPr>
+        <w:t>”</w:t>
       </w:r>
     </w:p>
     <w:p>
@@ -506,33 +379,174 @@
           <w:sz w:val="24"/>
           <w:szCs w:val="24"/>
         </w:rPr>
-        <w:t>Nombre del archivo de logs:</w:t>
-      </w:r>
-      <w:r>
-        <w:rPr>
-          <w:rFonts w:ascii="Arial" w:hAnsi="Arial" w:cs="Arial"/>
-          <w:sz w:val="24"/>
-          <w:szCs w:val="24"/>
-        </w:rPr>
-        <w:t xml:space="preserve"> “</w:t>
-      </w:r>
-      <w:proofErr w:type="spellStart"/>
-      <w:r>
-        <w:rPr>
-          <w:rFonts w:ascii="Arial" w:hAnsi="Arial" w:cs="Arial"/>
-          <w:sz w:val="24"/>
-          <w:szCs w:val="24"/>
-        </w:rPr>
-        <w:t>ToBE_log.ldf</w:t>
-      </w:r>
-      <w:proofErr w:type="spellEnd"/>
-      <w:r>
-        <w:rPr>
-          <w:rFonts w:ascii="Arial" w:hAnsi="Arial" w:cs="Arial"/>
-          <w:sz w:val="24"/>
-          <w:szCs w:val="24"/>
-        </w:rPr>
-        <w:t>”</w:t>
+        <w:t>Configuración de memoria</w:t>
+      </w:r>
+    </w:p>
+    <w:p>
+      <w:pPr>
+        <w:pStyle w:val="Prrafodelista"/>
+        <w:numPr>
+          <w:ilvl w:val="0"/>
+          <w:numId w:val="2"/>
+        </w:numPr>
+        <w:spacing w:after="200" w:line="276" w:lineRule="auto"/>
+        <w:rPr>
+          <w:rFonts w:ascii="Arial" w:hAnsi="Arial" w:cs="Arial"/>
+          <w:sz w:val="24"/>
+          <w:szCs w:val="24"/>
+        </w:rPr>
+      </w:pPr>
+      <w:r>
+        <w:rPr>
+          <w:rFonts w:ascii="Arial" w:hAnsi="Arial" w:cs="Arial"/>
+          <w:b/>
+          <w:bCs/>
+          <w:sz w:val="24"/>
+          <w:szCs w:val="24"/>
+        </w:rPr>
+        <w:t>Seguridad</w:t>
+      </w:r>
+    </w:p>
+    <w:p>
+      <w:pPr>
+        <w:pStyle w:val="Prrafodelista"/>
+        <w:numPr>
+          <w:ilvl w:val="0"/>
+          <w:numId w:val="2"/>
+        </w:numPr>
+        <w:spacing w:after="200" w:line="276" w:lineRule="auto"/>
+        <w:rPr>
+          <w:rFonts w:ascii="Arial" w:hAnsi="Arial" w:cs="Arial"/>
+          <w:sz w:val="24"/>
+          <w:szCs w:val="24"/>
+        </w:rPr>
+      </w:pPr>
+      <w:r>
+        <w:rPr>
+          <w:rFonts w:ascii="Arial" w:hAnsi="Arial" w:cs="Arial"/>
+          <w:b/>
+          <w:bCs/>
+          <w:sz w:val="24"/>
+          <w:szCs w:val="24"/>
+        </w:rPr>
+        <w:t>Collate</w:t>
+      </w:r>
+      <w:r>
+        <w:rPr>
+          <w:rFonts w:ascii="Arial" w:hAnsi="Arial" w:cs="Arial"/>
+          <w:sz w:val="24"/>
+          <w:szCs w:val="24"/>
+        </w:rPr>
+        <w:t xml:space="preserve"> Latin1</w:t>
+      </w:r>
+      <w:r>
+        <w:rPr>
+          <w:rFonts w:ascii="Arial" w:hAnsi="Arial" w:cs="Arial"/>
+          <w:sz w:val="24"/>
+          <w:szCs w:val="24"/>
+          <w:lang w:val="en-US"/>
+        </w:rPr>
+        <w:t>_General_CI_AI</w:t>
+      </w:r>
+    </w:p>
+    <w:p>
+      <w:pPr>
+        <w:pStyle w:val="Prrafodelista"/>
+        <w:numPr>
+          <w:ilvl w:val="0"/>
+          <w:numId w:val="2"/>
+        </w:numPr>
+        <w:spacing w:after="200" w:line="276" w:lineRule="auto"/>
+        <w:rPr>
+          <w:rFonts w:ascii="Arial" w:hAnsi="Arial" w:cs="Arial"/>
+          <w:sz w:val="24"/>
+          <w:szCs w:val="24"/>
+        </w:rPr>
+      </w:pPr>
+      <w:r>
+        <w:rPr>
+          <w:rFonts w:ascii="Arial" w:hAnsi="Arial" w:cs="Arial"/>
+          <w:b/>
+          <w:bCs/>
+          <w:sz w:val="24"/>
+          <w:szCs w:val="24"/>
+        </w:rPr>
+        <w:t>Puerto</w:t>
+      </w:r>
+    </w:p>
+    <w:p>
+      <w:pPr>
+        <w:pStyle w:val="Prrafodelista"/>
+        <w:numPr>
+          <w:ilvl w:val="0"/>
+          <w:numId w:val="2"/>
+        </w:numPr>
+        <w:spacing w:after="200" w:line="276" w:lineRule="auto"/>
+        <w:rPr>
+          <w:rFonts w:ascii="Arial" w:hAnsi="Arial" w:cs="Arial"/>
+          <w:sz w:val="24"/>
+          <w:szCs w:val="24"/>
+        </w:rPr>
+      </w:pPr>
+      <w:r>
+        <w:rPr>
+          <w:rFonts w:ascii="Arial" w:hAnsi="Arial" w:cs="Arial"/>
+          <w:b/>
+          <w:bCs/>
+          <w:sz w:val="24"/>
+          <w:szCs w:val="24"/>
+        </w:rPr>
+        <w:t>IP</w:t>
+      </w:r>
+    </w:p>
+    <w:p>
+      <w:pPr>
+        <w:pStyle w:val="Prrafodelista"/>
+        <w:numPr>
+          <w:ilvl w:val="0"/>
+          <w:numId w:val="2"/>
+        </w:numPr>
+        <w:spacing w:after="200" w:line="276" w:lineRule="auto"/>
+        <w:rPr>
+          <w:rFonts w:ascii="Arial" w:hAnsi="Arial" w:cs="Arial"/>
+          <w:sz w:val="24"/>
+          <w:szCs w:val="24"/>
+        </w:rPr>
+      </w:pPr>
+      <w:r>
+        <w:rPr>
+          <w:rFonts w:ascii="Arial" w:hAnsi="Arial" w:cs="Arial"/>
+          <w:b/>
+          <w:bCs/>
+          <w:sz w:val="24"/>
+          <w:szCs w:val="24"/>
+        </w:rPr>
+        <w:t>Servicios</w:t>
+      </w:r>
+    </w:p>
+    <w:p>
+      <w:pPr>
+        <w:pStyle w:val="Prrafodelista"/>
+        <w:numPr>
+          <w:ilvl w:val="0"/>
+          <w:numId w:val="2"/>
+        </w:numPr>
+        <w:spacing w:after="200" w:line="276" w:lineRule="auto"/>
+        <w:rPr>
+          <w:rFonts w:ascii="Arial" w:hAnsi="Arial" w:cs="Arial"/>
+          <w:sz w:val="24"/>
+          <w:szCs w:val="24"/>
+        </w:rPr>
+      </w:pPr>
+      <w:r>
+        <w:rPr>
+          <w:rFonts w:ascii="Arial" w:hAnsi="Arial" w:cs="Arial"/>
+          <w:b/>
+          <w:bCs/>
+          <w:sz w:val="24"/>
+          <w:szCs w:val="24"/>
+        </w:rPr>
+        <w:t>Requisitos de instalación</w:t>
       </w:r>
     </w:p>
     <w:p>
@@ -543,25 +557,22 @@
           <w:sz w:val="24"/>
           <w:szCs w:val="24"/>
           <w:u w:val="single"/>
-          <w:lang w:val="en-US"/>
-        </w:rPr>
-      </w:pPr>
-    </w:p>
-    <w:p>
-      <w:pPr>
-        <w:rPr>
-          <w:rFonts w:ascii="Arial" w:hAnsi="Arial" w:cs="Arial"/>
-          <w:sz w:val="24"/>
-          <w:szCs w:val="24"/>
-          <w:lang w:val="en-US"/>
-        </w:rPr>
-      </w:pPr>
-      <w:r>
-        <w:rPr>
-          <w:rFonts w:ascii="Arial" w:hAnsi="Arial" w:cs="Arial"/>
-          <w:sz w:val="24"/>
-          <w:szCs w:val="24"/>
-          <w:lang w:val="en-US"/>
+        </w:rPr>
+      </w:pPr>
+    </w:p>
+    <w:p>
+      <w:pPr>
+        <w:rPr>
+          <w:rFonts w:ascii="Arial" w:hAnsi="Arial" w:cs="Arial"/>
+          <w:sz w:val="24"/>
+          <w:szCs w:val="24"/>
+        </w:rPr>
+      </w:pPr>
+      <w:r>
+        <w:rPr>
+          <w:rFonts w:ascii="Arial" w:hAnsi="Arial" w:cs="Arial"/>
+          <w:sz w:val="24"/>
+          <w:szCs w:val="24"/>
         </w:rPr>
         <w:t xml:space="preserve"> </w:t>
       </w:r>
@@ -581,7 +592,7 @@
   <w:abstractNum w:abstractNumId="0" w15:restartNumberingAfterBreak="0">
     <w:nsid w:val="0ECA1C43"/>
     <w:multiLevelType w:val="hybridMultilevel"/>
-    <w:tmpl w:val="AB04228C"/>
+    <w:tmpl w:val="BE4AD2CE"/>
     <w:lvl w:ilvl="0" w:tplc="2C0A0001">
       <w:start w:val="1"/>
       <w:numFmt w:val="bullet"/>

</xml_diff>

<commit_message>
Entrega 4 (Faltan requisitos de instalación)
</commit_message>
<xml_diff>
--- a/documentación/Documentación Base de Datos To-BE.docx
+++ b/documentación/Documentación Base de Datos To-BE.docx
@@ -170,7 +170,25 @@
           <w:sz w:val="24"/>
           <w:szCs w:val="24"/>
         </w:rPr>
-        <w:t xml:space="preserve"> “C:\Program Files\Microsoft SQL Server”.</w:t>
+        <w:t xml:space="preserve"> “C:\</w:t>
+      </w:r>
+      <w:proofErr w:type="spellStart"/>
+      <w:r>
+        <w:rPr>
+          <w:rFonts w:ascii="Arial" w:hAnsi="Arial" w:cs="Arial"/>
+          <w:sz w:val="24"/>
+          <w:szCs w:val="24"/>
+        </w:rPr>
+        <w:t>Program</w:t>
+      </w:r>
+      <w:proofErr w:type="spellEnd"/>
+      <w:r>
+        <w:rPr>
+          <w:rFonts w:ascii="Arial" w:hAnsi="Arial" w:cs="Arial"/>
+          <w:sz w:val="24"/>
+          <w:szCs w:val="24"/>
+        </w:rPr>
+        <w:t xml:space="preserve"> Files\Microsoft SQL Server”.</w:t>
       </w:r>
     </w:p>
     <w:p>
@@ -188,6 +206,7 @@
           <w:lang w:val="en-US"/>
         </w:rPr>
       </w:pPr>
+      <w:proofErr w:type="spellStart"/>
       <w:r>
         <w:rPr>
           <w:rFonts w:ascii="Arial" w:hAnsi="Arial" w:cs="Arial"/>
@@ -197,7 +216,19 @@
           <w:szCs w:val="24"/>
           <w:lang w:val="en-US"/>
         </w:rPr>
-        <w:t>Ubicación del datafile:</w:t>
+        <w:t>Ubicación</w:t>
+      </w:r>
+      <w:proofErr w:type="spellEnd"/>
+      <w:r>
+        <w:rPr>
+          <w:rFonts w:ascii="Arial" w:hAnsi="Arial" w:cs="Arial"/>
+          <w:b/>
+          <w:bCs/>
+          <w:sz w:val="24"/>
+          <w:szCs w:val="24"/>
+          <w:lang w:val="en-US"/>
+        </w:rPr>
+        <w:t xml:space="preserve"> del datafile:</w:t>
       </w:r>
       <w:r>
         <w:rPr>
@@ -240,7 +271,29 @@
           <w:sz w:val="24"/>
           <w:szCs w:val="24"/>
         </w:rPr>
-        <w:t>Nombre del archivo de datafile:</w:t>
+        <w:t xml:space="preserve">Nombre del archivo de </w:t>
+      </w:r>
+      <w:proofErr w:type="spellStart"/>
+      <w:r>
+        <w:rPr>
+          <w:rFonts w:ascii="Arial" w:hAnsi="Arial" w:cs="Arial"/>
+          <w:b/>
+          <w:bCs/>
+          <w:sz w:val="24"/>
+          <w:szCs w:val="24"/>
+        </w:rPr>
+        <w:t>datafile</w:t>
+      </w:r>
+      <w:proofErr w:type="spellEnd"/>
+      <w:r>
+        <w:rPr>
+          <w:rFonts w:ascii="Arial" w:hAnsi="Arial" w:cs="Arial"/>
+          <w:b/>
+          <w:bCs/>
+          <w:sz w:val="24"/>
+          <w:szCs w:val="24"/>
+        </w:rPr>
+        <w:t>:</w:t>
       </w:r>
       <w:r>
         <w:rPr>
@@ -305,7 +358,25 @@
           <w:sz w:val="24"/>
           <w:szCs w:val="24"/>
         </w:rPr>
-        <w:t xml:space="preserve"> “C:\Program Files\Microsoft SQL Server\MSSQL16.SQLEXPRESS\MSSQL\DATA”.</w:t>
+        <w:t xml:space="preserve"> “C:\</w:t>
+      </w:r>
+      <w:proofErr w:type="spellStart"/>
+      <w:r>
+        <w:rPr>
+          <w:rFonts w:ascii="Arial" w:hAnsi="Arial" w:cs="Arial"/>
+          <w:sz w:val="24"/>
+          <w:szCs w:val="24"/>
+        </w:rPr>
+        <w:t>Program</w:t>
+      </w:r>
+      <w:proofErr w:type="spellEnd"/>
+      <w:r>
+        <w:rPr>
+          <w:rFonts w:ascii="Arial" w:hAnsi="Arial" w:cs="Arial"/>
+          <w:sz w:val="24"/>
+          <w:szCs w:val="24"/>
+        </w:rPr>
+        <w:t xml:space="preserve"> Files\Microsoft SQL Server\MSSQL16.SQLEXPRESS\MSSQL\DATA”.</w:t>
       </w:r>
     </w:p>
     <w:p>
@@ -340,6 +411,7 @@
         </w:rPr>
         <w:t xml:space="preserve"> “</w:t>
       </w:r>
+      <w:proofErr w:type="spellStart"/>
       <w:r>
         <w:rPr>
           <w:rFonts w:ascii="Arial" w:hAnsi="Arial" w:cs="Arial"/>
@@ -348,6 +420,7 @@
         </w:rPr>
         <w:t>ToBE_log.ldf</w:t>
       </w:r>
+      <w:proofErr w:type="spellEnd"/>
       <w:r>
         <w:rPr>
           <w:rFonts w:ascii="Arial" w:hAnsi="Arial" w:cs="Arial"/>
@@ -381,6 +454,174 @@
         </w:rPr>
         <w:t>Configuración de memoria</w:t>
       </w:r>
+      <w:r>
+        <w:rPr>
+          <w:rFonts w:ascii="Arial" w:hAnsi="Arial" w:cs="Arial"/>
+          <w:b/>
+          <w:bCs/>
+          <w:sz w:val="24"/>
+          <w:szCs w:val="24"/>
+        </w:rPr>
+        <w:t xml:space="preserve"> del servidor</w:t>
+      </w:r>
+      <w:r>
+        <w:rPr>
+          <w:rFonts w:ascii="Arial" w:hAnsi="Arial" w:cs="Arial"/>
+          <w:b/>
+          <w:bCs/>
+          <w:sz w:val="24"/>
+          <w:szCs w:val="24"/>
+        </w:rPr>
+        <w:t>:</w:t>
+      </w:r>
+    </w:p>
+    <w:p>
+      <w:pPr>
+        <w:pStyle w:val="Prrafodelista"/>
+        <w:numPr>
+          <w:ilvl w:val="0"/>
+          <w:numId w:val="3"/>
+        </w:numPr>
+        <w:spacing w:after="200" w:line="276" w:lineRule="auto"/>
+        <w:rPr>
+          <w:rFonts w:ascii="Arial" w:hAnsi="Arial" w:cs="Arial"/>
+          <w:sz w:val="24"/>
+          <w:szCs w:val="24"/>
+        </w:rPr>
+      </w:pPr>
+      <w:r>
+        <w:rPr>
+          <w:rFonts w:ascii="Arial" w:hAnsi="Arial" w:cs="Arial"/>
+          <w:sz w:val="24"/>
+          <w:szCs w:val="24"/>
+        </w:rPr>
+        <w:t>Cantidad m</w:t>
+      </w:r>
+      <w:proofErr w:type="spellStart"/>
+      <w:r>
+        <w:rPr>
+          <w:rFonts w:ascii="Arial" w:hAnsi="Arial" w:cs="Arial"/>
+          <w:sz w:val="24"/>
+          <w:szCs w:val="24"/>
+          <w:lang w:val="es-ES"/>
+        </w:rPr>
+        <w:t>ínima</w:t>
+      </w:r>
+      <w:proofErr w:type="spellEnd"/>
+      <w:r>
+        <w:rPr>
+          <w:rFonts w:ascii="Arial" w:hAnsi="Arial" w:cs="Arial"/>
+          <w:sz w:val="24"/>
+          <w:szCs w:val="24"/>
+        </w:rPr>
+        <w:t>: 0 MB</w:t>
+      </w:r>
+    </w:p>
+    <w:p>
+      <w:pPr>
+        <w:pStyle w:val="Prrafodelista"/>
+        <w:numPr>
+          <w:ilvl w:val="0"/>
+          <w:numId w:val="3"/>
+        </w:numPr>
+        <w:spacing w:after="200" w:line="276" w:lineRule="auto"/>
+        <w:rPr>
+          <w:rFonts w:ascii="Arial" w:hAnsi="Arial" w:cs="Arial"/>
+          <w:sz w:val="24"/>
+          <w:szCs w:val="24"/>
+        </w:rPr>
+      </w:pPr>
+      <w:r>
+        <w:rPr>
+          <w:rFonts w:ascii="Arial" w:hAnsi="Arial" w:cs="Arial"/>
+          <w:sz w:val="24"/>
+          <w:szCs w:val="24"/>
+        </w:rPr>
+        <w:t>Cantidad m</w:t>
+      </w:r>
+      <w:proofErr w:type="spellStart"/>
+      <w:r>
+        <w:rPr>
+          <w:rFonts w:ascii="Arial" w:hAnsi="Arial" w:cs="Arial"/>
+          <w:sz w:val="24"/>
+          <w:szCs w:val="24"/>
+          <w:lang w:val="es-ES"/>
+        </w:rPr>
+        <w:t>áxima</w:t>
+      </w:r>
+      <w:proofErr w:type="spellEnd"/>
+      <w:r>
+        <w:rPr>
+          <w:rFonts w:ascii="Arial" w:hAnsi="Arial" w:cs="Arial"/>
+          <w:sz w:val="24"/>
+          <w:szCs w:val="24"/>
+        </w:rPr>
+        <w:t xml:space="preserve">: </w:t>
+      </w:r>
+      <w:r>
+        <w:rPr>
+          <w:rFonts w:ascii="Arial" w:hAnsi="Arial" w:cs="Arial"/>
+          <w:sz w:val="24"/>
+          <w:szCs w:val="24"/>
+        </w:rPr>
+        <w:t>2</w:t>
+      </w:r>
+      <w:r>
+        <w:rPr>
+          <w:rFonts w:ascii="Arial" w:hAnsi="Arial" w:cs="Arial"/>
+          <w:sz w:val="24"/>
+          <w:szCs w:val="24"/>
+        </w:rPr>
+        <w:t>.</w:t>
+      </w:r>
+      <w:r>
+        <w:rPr>
+          <w:rFonts w:ascii="Arial" w:hAnsi="Arial" w:cs="Arial"/>
+          <w:sz w:val="24"/>
+          <w:szCs w:val="24"/>
+        </w:rPr>
+        <w:t>147</w:t>
+      </w:r>
+      <w:r>
+        <w:rPr>
+          <w:rFonts w:ascii="Arial" w:hAnsi="Arial" w:cs="Arial"/>
+          <w:sz w:val="24"/>
+          <w:szCs w:val="24"/>
+        </w:rPr>
+        <w:t>.</w:t>
+      </w:r>
+      <w:r>
+        <w:rPr>
+          <w:rFonts w:ascii="Arial" w:hAnsi="Arial" w:cs="Arial"/>
+          <w:sz w:val="24"/>
+          <w:szCs w:val="24"/>
+        </w:rPr>
+        <w:t>483</w:t>
+      </w:r>
+      <w:r>
+        <w:rPr>
+          <w:rFonts w:ascii="Arial" w:hAnsi="Arial" w:cs="Arial"/>
+          <w:sz w:val="24"/>
+          <w:szCs w:val="24"/>
+        </w:rPr>
+        <w:t>.</w:t>
+      </w:r>
+      <w:r>
+        <w:rPr>
+          <w:rFonts w:ascii="Arial" w:hAnsi="Arial" w:cs="Arial"/>
+          <w:sz w:val="24"/>
+          <w:szCs w:val="24"/>
+        </w:rPr>
+        <w:t>647</w:t>
+      </w:r>
+      <w:r>
+        <w:rPr>
+          <w:rFonts w:ascii="Arial" w:hAnsi="Arial" w:cs="Arial"/>
+          <w:sz w:val="24"/>
+          <w:szCs w:val="24"/>
+        </w:rPr>
+        <w:t xml:space="preserve"> MB</w:t>
+      </w:r>
     </w:p>
     <w:p>
       <w:pPr>
@@ -396,15 +637,98 @@
           <w:szCs w:val="24"/>
         </w:rPr>
       </w:pPr>
-      <w:r>
-        <w:rPr>
-          <w:rFonts w:ascii="Arial" w:hAnsi="Arial" w:cs="Arial"/>
-          <w:b/>
-          <w:bCs/>
-          <w:sz w:val="24"/>
-          <w:szCs w:val="24"/>
-        </w:rPr>
-        <w:t>Seguridad</w:t>
+      <w:proofErr w:type="spellStart"/>
+      <w:r>
+        <w:rPr>
+          <w:rFonts w:ascii="Arial" w:hAnsi="Arial" w:cs="Arial"/>
+          <w:b/>
+          <w:bCs/>
+          <w:sz w:val="24"/>
+          <w:szCs w:val="24"/>
+        </w:rPr>
+        <w:t>C</w:t>
+      </w:r>
+      <w:r>
+        <w:rPr>
+          <w:rFonts w:ascii="Arial" w:hAnsi="Arial" w:cs="Arial"/>
+          <w:b/>
+          <w:bCs/>
+          <w:sz w:val="24"/>
+          <w:szCs w:val="24"/>
+        </w:rPr>
+        <w:t>onfiguraci</w:t>
+      </w:r>
+      <w:r>
+        <w:rPr>
+          <w:rFonts w:ascii="Arial" w:hAnsi="Arial" w:cs="Arial"/>
+          <w:b/>
+          <w:bCs/>
+          <w:sz w:val="24"/>
+          <w:szCs w:val="24"/>
+          <w:lang w:val="es-ES"/>
+        </w:rPr>
+        <w:t>ón</w:t>
+      </w:r>
+      <w:proofErr w:type="spellEnd"/>
+      <w:r>
+        <w:rPr>
+          <w:rFonts w:ascii="Arial" w:hAnsi="Arial" w:cs="Arial"/>
+          <w:b/>
+          <w:bCs/>
+          <w:sz w:val="24"/>
+          <w:szCs w:val="24"/>
+          <w:lang w:val="es-ES"/>
+        </w:rPr>
+        <w:t xml:space="preserve"> de memoria del motor</w:t>
+      </w:r>
+      <w:r>
+        <w:rPr>
+          <w:rFonts w:ascii="Arial" w:hAnsi="Arial" w:cs="Arial"/>
+          <w:b/>
+          <w:bCs/>
+          <w:sz w:val="24"/>
+          <w:szCs w:val="24"/>
+        </w:rPr>
+        <w:t>:</w:t>
+      </w:r>
+    </w:p>
+    <w:p>
+      <w:pPr>
+        <w:pStyle w:val="Prrafodelista"/>
+        <w:numPr>
+          <w:ilvl w:val="0"/>
+          <w:numId w:val="4"/>
+        </w:numPr>
+        <w:spacing w:after="200" w:line="276" w:lineRule="auto"/>
+        <w:rPr>
+          <w:rFonts w:ascii="Arial" w:hAnsi="Arial" w:cs="Arial"/>
+          <w:sz w:val="24"/>
+          <w:szCs w:val="24"/>
+        </w:rPr>
+      </w:pPr>
+      <w:r>
+        <w:rPr>
+          <w:rFonts w:ascii="Arial" w:hAnsi="Arial" w:cs="Arial"/>
+          <w:sz w:val="24"/>
+          <w:szCs w:val="24"/>
+        </w:rPr>
+        <w:t>Cantidad mínima de memoria por consulta</w:t>
+      </w:r>
+      <w:r>
+        <w:rPr>
+          <w:rFonts w:ascii="Arial" w:hAnsi="Arial" w:cs="Arial"/>
+          <w:sz w:val="24"/>
+          <w:szCs w:val="24"/>
+        </w:rPr>
+        <w:t>:</w:t>
+      </w:r>
+      <w:r>
+        <w:rPr>
+          <w:rFonts w:ascii="Arial" w:hAnsi="Arial" w:cs="Arial"/>
+          <w:sz w:val="24"/>
+          <w:szCs w:val="24"/>
+        </w:rPr>
+        <w:t xml:space="preserve"> 1.024 KB (1 MB)</w:t>
       </w:r>
     </w:p>
     <w:p>
@@ -429,24 +753,135 @@
           <w:sz w:val="24"/>
           <w:szCs w:val="24"/>
         </w:rPr>
-        <w:t>Collate</w:t>
-      </w:r>
-      <w:r>
-        <w:rPr>
-          <w:rFonts w:ascii="Arial" w:hAnsi="Arial" w:cs="Arial"/>
-          <w:sz w:val="24"/>
-          <w:szCs w:val="24"/>
-        </w:rPr>
-        <w:t xml:space="preserve"> Latin1</w:t>
-      </w:r>
-      <w:r>
-        <w:rPr>
-          <w:rFonts w:ascii="Arial" w:hAnsi="Arial" w:cs="Arial"/>
-          <w:sz w:val="24"/>
-          <w:szCs w:val="24"/>
-          <w:lang w:val="en-US"/>
-        </w:rPr>
-        <w:t>_General_CI_AI</w:t>
+        <w:t>Seguridad</w:t>
+      </w:r>
+    </w:p>
+    <w:p>
+      <w:pPr>
+        <w:pStyle w:val="Prrafodelista"/>
+        <w:numPr>
+          <w:ilvl w:val="0"/>
+          <w:numId w:val="4"/>
+        </w:numPr>
+        <w:spacing w:after="200" w:line="276" w:lineRule="auto"/>
+        <w:rPr>
+          <w:rFonts w:ascii="Arial" w:hAnsi="Arial" w:cs="Arial"/>
+          <w:sz w:val="24"/>
+          <w:szCs w:val="24"/>
+          <w:lang w:val="es-ES"/>
+        </w:rPr>
+      </w:pPr>
+      <w:r>
+        <w:rPr>
+          <w:rFonts w:ascii="Arial" w:hAnsi="Arial" w:cs="Arial"/>
+          <w:sz w:val="24"/>
+          <w:szCs w:val="24"/>
+          <w:lang w:val="es-ES"/>
+        </w:rPr>
+        <w:t>Autenticación del servidor</w:t>
+      </w:r>
+      <w:r>
+        <w:rPr>
+          <w:rFonts w:ascii="Arial" w:hAnsi="Arial" w:cs="Arial"/>
+          <w:sz w:val="24"/>
+          <w:szCs w:val="24"/>
+        </w:rPr>
+        <w:t xml:space="preserve">: Modo de </w:t>
+      </w:r>
+      <w:r>
+        <w:rPr>
+          <w:rFonts w:ascii="Arial" w:hAnsi="Arial" w:cs="Arial"/>
+          <w:sz w:val="24"/>
+          <w:szCs w:val="24"/>
+        </w:rPr>
+        <w:t>autenticación</w:t>
+      </w:r>
+      <w:r>
+        <w:rPr>
+          <w:rFonts w:ascii="Arial" w:hAnsi="Arial" w:cs="Arial"/>
+          <w:sz w:val="24"/>
+          <w:szCs w:val="24"/>
+          <w:lang w:val="es-ES"/>
+        </w:rPr>
+        <w:t xml:space="preserve"> de Windows y SQL Server</w:t>
+      </w:r>
+    </w:p>
+    <w:p>
+      <w:pPr>
+        <w:pStyle w:val="Prrafodelista"/>
+        <w:numPr>
+          <w:ilvl w:val="0"/>
+          <w:numId w:val="4"/>
+        </w:numPr>
+        <w:spacing w:after="200" w:line="276" w:lineRule="auto"/>
+        <w:rPr>
+          <w:rFonts w:ascii="Arial" w:hAnsi="Arial" w:cs="Arial"/>
+          <w:sz w:val="24"/>
+          <w:szCs w:val="24"/>
+          <w:lang w:val="es-ES"/>
+        </w:rPr>
+      </w:pPr>
+      <w:r>
+        <w:rPr>
+          <w:rFonts w:ascii="Arial" w:hAnsi="Arial" w:cs="Arial"/>
+          <w:sz w:val="24"/>
+          <w:szCs w:val="24"/>
+          <w:lang w:val="es-ES"/>
+        </w:rPr>
+        <w:t>Auditoría de inicio de sesión</w:t>
+      </w:r>
+      <w:r>
+        <w:rPr>
+          <w:rFonts w:ascii="Arial" w:hAnsi="Arial" w:cs="Arial"/>
+          <w:sz w:val="24"/>
+          <w:szCs w:val="24"/>
+        </w:rPr>
+        <w:t>:</w:t>
+      </w:r>
+      <w:r>
+        <w:rPr>
+          <w:rFonts w:ascii="Arial" w:hAnsi="Arial" w:cs="Arial"/>
+          <w:sz w:val="24"/>
+          <w:szCs w:val="24"/>
+        </w:rPr>
+        <w:t xml:space="preserve"> </w:t>
+      </w:r>
+      <w:r>
+        <w:rPr>
+          <w:rFonts w:ascii="Arial" w:hAnsi="Arial" w:cs="Arial"/>
+          <w:sz w:val="24"/>
+          <w:szCs w:val="24"/>
+        </w:rPr>
+        <w:t>S</w:t>
+      </w:r>
+      <w:proofErr w:type="spellStart"/>
+      <w:r>
+        <w:rPr>
+          <w:rFonts w:ascii="Arial" w:hAnsi="Arial" w:cs="Arial"/>
+          <w:sz w:val="24"/>
+          <w:szCs w:val="24"/>
+          <w:lang w:val="es-ES"/>
+        </w:rPr>
+        <w:t>ólo</w:t>
+      </w:r>
+      <w:proofErr w:type="spellEnd"/>
+      <w:r>
+        <w:rPr>
+          <w:rFonts w:ascii="Arial" w:hAnsi="Arial" w:cs="Arial"/>
+          <w:sz w:val="24"/>
+          <w:szCs w:val="24"/>
+          <w:lang w:val="es-ES"/>
+        </w:rPr>
+        <w:t xml:space="preserve"> inicios de sesión erróneo</w:t>
+      </w:r>
+      <w:r>
+        <w:rPr>
+          <w:rFonts w:ascii="Arial" w:hAnsi="Arial" w:cs="Arial"/>
+          <w:sz w:val="24"/>
+          <w:szCs w:val="24"/>
+          <w:lang w:val="es-ES"/>
+        </w:rPr>
+        <w:t>s</w:t>
       </w:r>
     </w:p>
     <w:p>
@@ -463,15 +898,87 @@
           <w:szCs w:val="24"/>
         </w:rPr>
       </w:pPr>
-      <w:r>
-        <w:rPr>
-          <w:rFonts w:ascii="Arial" w:hAnsi="Arial" w:cs="Arial"/>
-          <w:b/>
-          <w:bCs/>
-          <w:sz w:val="24"/>
-          <w:szCs w:val="24"/>
-        </w:rPr>
-        <w:t>Puerto</w:t>
+      <w:proofErr w:type="spellStart"/>
+      <w:r>
+        <w:rPr>
+          <w:rFonts w:ascii="Arial" w:hAnsi="Arial" w:cs="Arial"/>
+          <w:b/>
+          <w:bCs/>
+          <w:sz w:val="24"/>
+          <w:szCs w:val="24"/>
+        </w:rPr>
+        <w:t>Collate</w:t>
+      </w:r>
+      <w:proofErr w:type="spellEnd"/>
+      <w:r>
+        <w:rPr>
+          <w:rFonts w:ascii="Arial" w:hAnsi="Arial" w:cs="Arial"/>
+          <w:b/>
+          <w:bCs/>
+          <w:sz w:val="24"/>
+          <w:szCs w:val="24"/>
+        </w:rPr>
+        <w:t xml:space="preserve"> (</w:t>
+      </w:r>
+      <w:proofErr w:type="spellStart"/>
+      <w:r>
+        <w:rPr>
+          <w:rFonts w:ascii="Arial" w:hAnsi="Arial" w:cs="Arial"/>
+          <w:b/>
+          <w:bCs/>
+          <w:sz w:val="24"/>
+          <w:szCs w:val="24"/>
+        </w:rPr>
+        <w:t>Intercalaci</w:t>
+      </w:r>
+      <w:r>
+        <w:rPr>
+          <w:rFonts w:ascii="Arial" w:hAnsi="Arial" w:cs="Arial"/>
+          <w:b/>
+          <w:bCs/>
+          <w:sz w:val="24"/>
+          <w:szCs w:val="24"/>
+          <w:lang w:val="es-ES"/>
+        </w:rPr>
+        <w:t>ón</w:t>
+      </w:r>
+      <w:proofErr w:type="spellEnd"/>
+      <w:r>
+        <w:rPr>
+          <w:rFonts w:ascii="Arial" w:hAnsi="Arial" w:cs="Arial"/>
+          <w:b/>
+          <w:bCs/>
+          <w:sz w:val="24"/>
+          <w:szCs w:val="24"/>
+          <w:lang w:val="es-ES"/>
+        </w:rPr>
+        <w:t>)</w:t>
+      </w:r>
+      <w:r>
+        <w:rPr>
+          <w:rFonts w:ascii="Arial" w:hAnsi="Arial" w:cs="Arial"/>
+          <w:b/>
+          <w:bCs/>
+          <w:sz w:val="24"/>
+          <w:szCs w:val="24"/>
+        </w:rPr>
+        <w:t>:</w:t>
+      </w:r>
+      <w:r>
+        <w:rPr>
+          <w:rFonts w:ascii="Arial" w:hAnsi="Arial" w:cs="Arial"/>
+          <w:sz w:val="24"/>
+          <w:szCs w:val="24"/>
+        </w:rPr>
+        <w:t xml:space="preserve"> Latin1</w:t>
+      </w:r>
+      <w:r>
+        <w:rPr>
+          <w:rFonts w:ascii="Arial" w:hAnsi="Arial" w:cs="Arial"/>
+          <w:sz w:val="24"/>
+          <w:szCs w:val="24"/>
+        </w:rPr>
+        <w:t>_General_CI_AI</w:t>
       </w:r>
     </w:p>
     <w:p>
@@ -496,7 +1003,35 @@
           <w:sz w:val="24"/>
           <w:szCs w:val="24"/>
         </w:rPr>
-        <w:t>IP</w:t>
+        <w:t>Puerto</w:t>
+      </w:r>
+      <w:r>
+        <w:rPr>
+          <w:rFonts w:ascii="Arial" w:hAnsi="Arial" w:cs="Arial"/>
+          <w:b/>
+          <w:bCs/>
+          <w:sz w:val="24"/>
+          <w:szCs w:val="24"/>
+        </w:rPr>
+        <w:t>:</w:t>
+      </w:r>
+      <w:r>
+        <w:rPr>
+          <w:rFonts w:ascii="Arial" w:hAnsi="Arial" w:cs="Arial"/>
+          <w:b/>
+          <w:bCs/>
+          <w:sz w:val="24"/>
+          <w:szCs w:val="24"/>
+        </w:rPr>
+        <w:t xml:space="preserve"> </w:t>
+      </w:r>
+      <w:r>
+        <w:rPr>
+          <w:rFonts w:ascii="Arial" w:hAnsi="Arial" w:cs="Arial"/>
+          <w:sz w:val="24"/>
+          <w:szCs w:val="24"/>
+        </w:rPr>
+        <w:t>TCP 1433</w:t>
       </w:r>
     </w:p>
     <w:p>
@@ -521,7 +1056,17 @@
           <w:sz w:val="24"/>
           <w:szCs w:val="24"/>
         </w:rPr>
-        <w:t>Servicios</w:t>
+        <w:t>IP</w:t>
+      </w:r>
+      <w:r>
+        <w:rPr>
+          <w:rFonts w:ascii="Arial" w:hAnsi="Arial" w:cs="Arial"/>
+          <w:b/>
+          <w:bCs/>
+          <w:sz w:val="24"/>
+          <w:szCs w:val="24"/>
+        </w:rPr>
+        <w:t xml:space="preserve"> </w:t>
       </w:r>
     </w:p>
     <w:p>
@@ -546,7 +1091,303 @@
           <w:sz w:val="24"/>
           <w:szCs w:val="24"/>
         </w:rPr>
+        <w:t>Servicios</w:t>
+      </w:r>
+      <w:r>
+        <w:rPr>
+          <w:rFonts w:ascii="Arial" w:hAnsi="Arial" w:cs="Arial"/>
+          <w:b/>
+          <w:bCs/>
+          <w:sz w:val="24"/>
+          <w:szCs w:val="24"/>
+        </w:rPr>
+        <w:t>:</w:t>
+      </w:r>
+    </w:p>
+    <w:p>
+      <w:pPr>
+        <w:pStyle w:val="Prrafodelista"/>
+        <w:spacing w:after="200" w:line="276" w:lineRule="auto"/>
+        <w:rPr>
+          <w:rFonts w:ascii="Arial" w:hAnsi="Arial" w:cs="Arial"/>
+          <w:sz w:val="24"/>
+          <w:szCs w:val="24"/>
+        </w:rPr>
+      </w:pPr>
+      <w:r>
+        <w:rPr>
+          <w:rFonts w:ascii="Arial" w:hAnsi="Arial" w:cs="Arial"/>
+          <w:sz w:val="24"/>
+          <w:szCs w:val="24"/>
+        </w:rPr>
+        <w:t>NOMBRE_SERVICIO: MSSQL$SQLEXPRESS</w:t>
+      </w:r>
+    </w:p>
+    <w:p>
+      <w:pPr>
+        <w:pStyle w:val="Prrafodelista"/>
+        <w:spacing w:after="200" w:line="276" w:lineRule="auto"/>
+        <w:rPr>
+          <w:rFonts w:ascii="Arial" w:hAnsi="Arial" w:cs="Arial"/>
+          <w:sz w:val="24"/>
+          <w:szCs w:val="24"/>
+        </w:rPr>
+      </w:pPr>
+      <w:r>
+        <w:rPr>
+          <w:rFonts w:ascii="Arial" w:hAnsi="Arial" w:cs="Arial"/>
+          <w:sz w:val="24"/>
+          <w:szCs w:val="24"/>
+        </w:rPr>
+        <w:t>NOMBRE_</w:t>
+      </w:r>
+      <w:r>
+        <w:rPr>
+          <w:rFonts w:ascii="Arial" w:hAnsi="Arial" w:cs="Arial"/>
+          <w:sz w:val="24"/>
+          <w:szCs w:val="24"/>
+        </w:rPr>
+        <w:t>MOSTRAR:</w:t>
+      </w:r>
+      <w:r>
+        <w:rPr>
+          <w:rFonts w:ascii="Arial" w:hAnsi="Arial" w:cs="Arial"/>
+          <w:sz w:val="24"/>
+          <w:szCs w:val="24"/>
+        </w:rPr>
+        <w:t xml:space="preserve"> SQL Server (SQLEXPRESS)</w:t>
+      </w:r>
+    </w:p>
+    <w:p>
+      <w:pPr>
+        <w:pStyle w:val="Prrafodelista"/>
+        <w:spacing w:after="200" w:line="276" w:lineRule="auto"/>
+        <w:rPr>
+          <w:rFonts w:ascii="Arial" w:hAnsi="Arial" w:cs="Arial"/>
+          <w:sz w:val="24"/>
+          <w:szCs w:val="24"/>
+        </w:rPr>
+      </w:pPr>
+      <w:r>
+        <w:rPr>
+          <w:rFonts w:ascii="Arial" w:hAnsi="Arial" w:cs="Arial"/>
+          <w:sz w:val="24"/>
+          <w:szCs w:val="24"/>
+        </w:rPr>
+        <w:t>NOMBRE_SERVICIO: SQLTELEMETRY$SQLEXPRESS</w:t>
+      </w:r>
+    </w:p>
+    <w:p>
+      <w:pPr>
+        <w:pStyle w:val="Prrafodelista"/>
+        <w:spacing w:after="200" w:line="276" w:lineRule="auto"/>
+        <w:rPr>
+          <w:rFonts w:ascii="Arial" w:hAnsi="Arial" w:cs="Arial"/>
+          <w:sz w:val="24"/>
+          <w:szCs w:val="24"/>
+        </w:rPr>
+      </w:pPr>
+      <w:r>
+        <w:rPr>
+          <w:rFonts w:ascii="Arial" w:hAnsi="Arial" w:cs="Arial"/>
+          <w:sz w:val="24"/>
+          <w:szCs w:val="24"/>
+        </w:rPr>
+        <w:t>NOMBRE_</w:t>
+      </w:r>
+      <w:r>
+        <w:rPr>
+          <w:rFonts w:ascii="Arial" w:hAnsi="Arial" w:cs="Arial"/>
+          <w:sz w:val="24"/>
+          <w:szCs w:val="24"/>
+        </w:rPr>
+        <w:t>MOSTRAR:</w:t>
+      </w:r>
+      <w:r>
+        <w:rPr>
+          <w:rFonts w:ascii="Arial" w:hAnsi="Arial" w:cs="Arial"/>
+          <w:sz w:val="24"/>
+          <w:szCs w:val="24"/>
+        </w:rPr>
+        <w:t xml:space="preserve"> SQL Server CEIP </w:t>
+      </w:r>
+      <w:proofErr w:type="spellStart"/>
+      <w:r>
+        <w:rPr>
+          <w:rFonts w:ascii="Arial" w:hAnsi="Arial" w:cs="Arial"/>
+          <w:sz w:val="24"/>
+          <w:szCs w:val="24"/>
+        </w:rPr>
+        <w:t>service</w:t>
+      </w:r>
+      <w:proofErr w:type="spellEnd"/>
+      <w:r>
+        <w:rPr>
+          <w:rFonts w:ascii="Arial" w:hAnsi="Arial" w:cs="Arial"/>
+          <w:sz w:val="24"/>
+          <w:szCs w:val="24"/>
+        </w:rPr>
+        <w:t xml:space="preserve"> (SQLEXPRESS)</w:t>
+      </w:r>
+    </w:p>
+    <w:p>
+      <w:pPr>
+        <w:pStyle w:val="Prrafodelista"/>
+        <w:spacing w:after="200" w:line="276" w:lineRule="auto"/>
+        <w:rPr>
+          <w:rFonts w:ascii="Arial" w:hAnsi="Arial" w:cs="Arial"/>
+          <w:sz w:val="24"/>
+          <w:szCs w:val="24"/>
+        </w:rPr>
+      </w:pPr>
+      <w:r>
+        <w:rPr>
+          <w:rFonts w:ascii="Arial" w:hAnsi="Arial" w:cs="Arial"/>
+          <w:sz w:val="24"/>
+          <w:szCs w:val="24"/>
+        </w:rPr>
+        <w:t xml:space="preserve">NOMBRE_SERVICIO: </w:t>
+      </w:r>
+      <w:proofErr w:type="spellStart"/>
+      <w:r>
+        <w:rPr>
+          <w:rFonts w:ascii="Arial" w:hAnsi="Arial" w:cs="Arial"/>
+          <w:sz w:val="24"/>
+          <w:szCs w:val="24"/>
+        </w:rPr>
+        <w:t>SQLWriter</w:t>
+      </w:r>
+      <w:proofErr w:type="spellEnd"/>
+    </w:p>
+    <w:p>
+      <w:pPr>
+        <w:pStyle w:val="Prrafodelista"/>
+        <w:spacing w:after="200" w:line="276" w:lineRule="auto"/>
+        <w:rPr>
+          <w:rFonts w:ascii="Arial" w:hAnsi="Arial" w:cs="Arial"/>
+          <w:sz w:val="24"/>
+          <w:szCs w:val="24"/>
+        </w:rPr>
+      </w:pPr>
+      <w:r>
+        <w:rPr>
+          <w:rFonts w:ascii="Arial" w:hAnsi="Arial" w:cs="Arial"/>
+          <w:sz w:val="24"/>
+          <w:szCs w:val="24"/>
+        </w:rPr>
+        <w:t>NOMBRE_</w:t>
+      </w:r>
+      <w:r>
+        <w:rPr>
+          <w:rFonts w:ascii="Arial" w:hAnsi="Arial" w:cs="Arial"/>
+          <w:sz w:val="24"/>
+          <w:szCs w:val="24"/>
+        </w:rPr>
+        <w:t>MOSTRAR:</w:t>
+      </w:r>
+      <w:r>
+        <w:rPr>
+          <w:rFonts w:ascii="Arial" w:hAnsi="Arial" w:cs="Arial"/>
+          <w:sz w:val="24"/>
+          <w:szCs w:val="24"/>
+        </w:rPr>
+        <w:t xml:space="preserve"> SQL Server VSS </w:t>
+      </w:r>
+      <w:proofErr w:type="spellStart"/>
+      <w:r>
+        <w:rPr>
+          <w:rFonts w:ascii="Arial" w:hAnsi="Arial" w:cs="Arial"/>
+          <w:sz w:val="24"/>
+          <w:szCs w:val="24"/>
+        </w:rPr>
+        <w:t>Writer</w:t>
+      </w:r>
+      <w:proofErr w:type="spellEnd"/>
+    </w:p>
+    <w:p>
+      <w:pPr>
+        <w:pStyle w:val="Prrafodelista"/>
+        <w:numPr>
+          <w:ilvl w:val="0"/>
+          <w:numId w:val="2"/>
+        </w:numPr>
+        <w:spacing w:after="200" w:line="276" w:lineRule="auto"/>
+        <w:rPr>
+          <w:rFonts w:ascii="Arial" w:hAnsi="Arial" w:cs="Arial"/>
+          <w:sz w:val="24"/>
+          <w:szCs w:val="24"/>
+        </w:rPr>
+      </w:pPr>
+      <w:r>
+        <w:rPr>
+          <w:rFonts w:ascii="Arial" w:hAnsi="Arial" w:cs="Arial"/>
+          <w:b/>
+          <w:bCs/>
+          <w:sz w:val="24"/>
+          <w:szCs w:val="24"/>
+        </w:rPr>
         <w:t>Requisitos de instalación</w:t>
+      </w:r>
+      <w:r>
+        <w:rPr>
+          <w:rFonts w:ascii="Arial" w:hAnsi="Arial" w:cs="Arial"/>
+          <w:b/>
+          <w:bCs/>
+          <w:sz w:val="24"/>
+          <w:szCs w:val="24"/>
+        </w:rPr>
+        <w:t xml:space="preserve"> </w:t>
+      </w:r>
+    </w:p>
+    <w:p>
+      <w:pPr>
+        <w:pStyle w:val="Prrafodelista"/>
+        <w:numPr>
+          <w:ilvl w:val="0"/>
+          <w:numId w:val="2"/>
+        </w:numPr>
+        <w:spacing w:after="200" w:line="276" w:lineRule="auto"/>
+        <w:rPr>
+          <w:rFonts w:ascii="Arial" w:hAnsi="Arial" w:cs="Arial"/>
+          <w:sz w:val="24"/>
+          <w:szCs w:val="24"/>
+        </w:rPr>
+      </w:pPr>
+      <w:r>
+        <w:rPr>
+          <w:rFonts w:ascii="Arial" w:hAnsi="Arial" w:cs="Arial"/>
+          <w:b/>
+          <w:bCs/>
+          <w:sz w:val="24"/>
+          <w:szCs w:val="24"/>
+        </w:rPr>
+        <w:t>Nivel de compatibilidad</w:t>
+      </w:r>
+      <w:r>
+        <w:rPr>
+          <w:rFonts w:ascii="Arial" w:hAnsi="Arial" w:cs="Arial"/>
+          <w:b/>
+          <w:bCs/>
+          <w:sz w:val="24"/>
+          <w:szCs w:val="24"/>
+        </w:rPr>
+        <w:t xml:space="preserve">: </w:t>
+      </w:r>
+      <w:r>
+        <w:rPr>
+          <w:rFonts w:ascii="Arial" w:hAnsi="Arial" w:cs="Arial"/>
+          <w:sz w:val="24"/>
+          <w:szCs w:val="24"/>
+        </w:rPr>
+        <w:t>SQL S</w:t>
+      </w:r>
+      <w:r>
+        <w:rPr>
+          <w:rFonts w:ascii="Arial" w:hAnsi="Arial" w:cs="Arial"/>
+          <w:sz w:val="24"/>
+          <w:szCs w:val="24"/>
+        </w:rPr>
+        <w:t>erver 2022 (160)</w:t>
       </w:r>
     </w:p>
     <w:p>
@@ -590,9 +1431,122 @@
 <file path=word/numbering.xml><?xml version="1.0" encoding="utf-8"?>
 <w:numbering xmlns:wpc="http://schemas.microsoft.com/office/word/2010/wordprocessingCanvas" xmlns:cx="http://schemas.microsoft.com/office/drawing/2014/chartex" xmlns:cx1="http://schemas.microsoft.com/office/drawing/2015/9/8/chartex" xmlns:cx2="http://schemas.microsoft.com/office/drawing/2015/10/21/chartex" xmlns:cx3="http://schemas.microsoft.com/office/drawing/2016/5/9/chartex" xmlns:cx4="http://schemas.microsoft.com/office/drawing/2016/5/10/chartex" xmlns:cx5="http://schemas.microsoft.com/office/drawing/2016/5/11/chartex" xmlns:cx6="http://schemas.microsoft.com/office/drawing/2016/5/12/chartex" xmlns:cx7="http://schemas.microsoft.com/office/drawing/2016/5/13/chartex" xmlns:cx8="http://schemas.microsoft.com/office/drawing/2016/5/14/chartex" xmlns:mc="http://schemas.openxmlformats.org/markup-compatibility/2006" xmlns:aink="http://schemas.microsoft.com/office/drawing/2016/ink" xmlns:am3d="http://schemas.microsoft.com/office/drawing/2017/model3d" xmlns:o="urn:schemas-microsoft-com:office:office" xmlns:r="http://schemas.openxmlformats.org/officeDocument/2006/relationships" xmlns:m="http://schemas.openxmlformats.org/officeDocument/2006/math" xmlns:v="urn:schemas-microsoft-com:vml" xmlns:wp14="http://schemas.microsoft.com/office/word/2010/wordprocessingDrawing" xmlns:wp="http://schemas.openxmlformats.org/drawingml/2006/wordprocessingDrawing" xmlns:w10="urn:schemas-microsoft-com:office:word" xmlns:w="http://schemas.openxmlformats.org/wordprocessingml/2006/main" xmlns:w14="http://schemas.microsoft.com/office/word/2010/wordml" xmlns:w15="http://schemas.microsoft.com/office/word/2012/wordml" xmlns:w16cex="http://schemas.microsoft.com/office/word/2018/wordml/cex" xmlns:w16cid="http://schemas.microsoft.com/office/word/2016/wordml/cid" xmlns:w16="http://schemas.microsoft.com/office/word/2018/wordml" xmlns:w16sdtdh="http://schemas.microsoft.com/office/word/2020/wordml/sdtdatahash" xmlns:w16se="http://schemas.microsoft.com/office/word/2015/wordml/symex" xmlns:wpg="http://schemas.microsoft.com/office/word/2010/wordprocessingGroup" xmlns:wpi="http://schemas.microsoft.com/office/word/2010/wordprocessingInk" xmlns:wne="http://schemas.microsoft.com/office/word/2006/wordml" xmlns:wps="http://schemas.microsoft.com/office/word/2010/wordprocessingShape" mc:Ignorable="w14 w15 w16se w16cid w16 w16cex w16sdtdh wp14">
   <w:abstractNum w:abstractNumId="0" w15:restartNumberingAfterBreak="0">
+    <w:nsid w:val="00E037F7"/>
+    <w:multiLevelType w:val="hybridMultilevel"/>
+    <w:tmpl w:val="C694CE80"/>
+    <w:lvl w:ilvl="0" w:tplc="2C0A0003">
+      <w:start w:val="1"/>
+      <w:numFmt w:val="bullet"/>
+      <w:lvlText w:val="o"/>
+      <w:lvlJc w:val="left"/>
+      <w:pPr>
+        <w:ind w:left="1440" w:hanging="360"/>
+      </w:pPr>
+      <w:rPr>
+        <w:rFonts w:ascii="Courier New" w:hAnsi="Courier New" w:cs="Courier New" w:hint="default"/>
+      </w:rPr>
+    </w:lvl>
+    <w:lvl w:ilvl="1" w:tplc="2C0A0003" w:tentative="1">
+      <w:start w:val="1"/>
+      <w:numFmt w:val="bullet"/>
+      <w:lvlText w:val="o"/>
+      <w:lvlJc w:val="left"/>
+      <w:pPr>
+        <w:ind w:left="2160" w:hanging="360"/>
+      </w:pPr>
+      <w:rPr>
+        <w:rFonts w:ascii="Courier New" w:hAnsi="Courier New" w:cs="Courier New" w:hint="default"/>
+      </w:rPr>
+    </w:lvl>
+    <w:lvl w:ilvl="2" w:tplc="2C0A0005" w:tentative="1">
+      <w:start w:val="1"/>
+      <w:numFmt w:val="bullet"/>
+      <w:lvlText w:val=""/>
+      <w:lvlJc w:val="left"/>
+      <w:pPr>
+        <w:ind w:left="2880" w:hanging="360"/>
+      </w:pPr>
+      <w:rPr>
+        <w:rFonts w:ascii="Wingdings" w:hAnsi="Wingdings" w:hint="default"/>
+      </w:rPr>
+    </w:lvl>
+    <w:lvl w:ilvl="3" w:tplc="2C0A0001" w:tentative="1">
+      <w:start w:val="1"/>
+      <w:numFmt w:val="bullet"/>
+      <w:lvlText w:val=""/>
+      <w:lvlJc w:val="left"/>
+      <w:pPr>
+        <w:ind w:left="3600" w:hanging="360"/>
+      </w:pPr>
+      <w:rPr>
+        <w:rFonts w:ascii="Symbol" w:hAnsi="Symbol" w:hint="default"/>
+      </w:rPr>
+    </w:lvl>
+    <w:lvl w:ilvl="4" w:tplc="2C0A0003" w:tentative="1">
+      <w:start w:val="1"/>
+      <w:numFmt w:val="bullet"/>
+      <w:lvlText w:val="o"/>
+      <w:lvlJc w:val="left"/>
+      <w:pPr>
+        <w:ind w:left="4320" w:hanging="360"/>
+      </w:pPr>
+      <w:rPr>
+        <w:rFonts w:ascii="Courier New" w:hAnsi="Courier New" w:cs="Courier New" w:hint="default"/>
+      </w:rPr>
+    </w:lvl>
+    <w:lvl w:ilvl="5" w:tplc="2C0A0005" w:tentative="1">
+      <w:start w:val="1"/>
+      <w:numFmt w:val="bullet"/>
+      <w:lvlText w:val=""/>
+      <w:lvlJc w:val="left"/>
+      <w:pPr>
+        <w:ind w:left="5040" w:hanging="360"/>
+      </w:pPr>
+      <w:rPr>
+        <w:rFonts w:ascii="Wingdings" w:hAnsi="Wingdings" w:hint="default"/>
+      </w:rPr>
+    </w:lvl>
+    <w:lvl w:ilvl="6" w:tplc="2C0A0001" w:tentative="1">
+      <w:start w:val="1"/>
+      <w:numFmt w:val="bullet"/>
+      <w:lvlText w:val=""/>
+      <w:lvlJc w:val="left"/>
+      <w:pPr>
+        <w:ind w:left="5760" w:hanging="360"/>
+      </w:pPr>
+      <w:rPr>
+        <w:rFonts w:ascii="Symbol" w:hAnsi="Symbol" w:hint="default"/>
+      </w:rPr>
+    </w:lvl>
+    <w:lvl w:ilvl="7" w:tplc="2C0A0003" w:tentative="1">
+      <w:start w:val="1"/>
+      <w:numFmt w:val="bullet"/>
+      <w:lvlText w:val="o"/>
+      <w:lvlJc w:val="left"/>
+      <w:pPr>
+        <w:ind w:left="6480" w:hanging="360"/>
+      </w:pPr>
+      <w:rPr>
+        <w:rFonts w:ascii="Courier New" w:hAnsi="Courier New" w:cs="Courier New" w:hint="default"/>
+      </w:rPr>
+    </w:lvl>
+    <w:lvl w:ilvl="8" w:tplc="2C0A0005" w:tentative="1">
+      <w:start w:val="1"/>
+      <w:numFmt w:val="bullet"/>
+      <w:lvlText w:val=""/>
+      <w:lvlJc w:val="left"/>
+      <w:pPr>
+        <w:ind w:left="7200" w:hanging="360"/>
+      </w:pPr>
+      <w:rPr>
+        <w:rFonts w:ascii="Wingdings" w:hAnsi="Wingdings" w:hint="default"/>
+      </w:rPr>
+    </w:lvl>
+  </w:abstractNum>
+  <w:abstractNum w:abstractNumId="1" w15:restartNumberingAfterBreak="0">
     <w:nsid w:val="0ECA1C43"/>
     <w:multiLevelType w:val="hybridMultilevel"/>
-    <w:tmpl w:val="BE4AD2CE"/>
+    <w:tmpl w:val="F604A12A"/>
     <w:lvl w:ilvl="0" w:tplc="2C0A0001">
       <w:start w:val="1"/>
       <w:numFmt w:val="bullet"/>
@@ -702,7 +1656,7 @@
       </w:rPr>
     </w:lvl>
   </w:abstractNum>
-  <w:abstractNum w:abstractNumId="1" w15:restartNumberingAfterBreak="0">
+  <w:abstractNum w:abstractNumId="2" w15:restartNumberingAfterBreak="0">
     <w:nsid w:val="13CF1AF0"/>
     <w:multiLevelType w:val="hybridMultilevel"/>
     <w:tmpl w:val="40A8D96A"/>
@@ -815,10 +1769,129 @@
       </w:rPr>
     </w:lvl>
   </w:abstractNum>
+  <w:abstractNum w:abstractNumId="3" w15:restartNumberingAfterBreak="0">
+    <w:nsid w:val="27A51261"/>
+    <w:multiLevelType w:val="hybridMultilevel"/>
+    <w:tmpl w:val="C2EEE07A"/>
+    <w:lvl w:ilvl="0" w:tplc="2C0A0003">
+      <w:start w:val="1"/>
+      <w:numFmt w:val="bullet"/>
+      <w:lvlText w:val="o"/>
+      <w:lvlJc w:val="left"/>
+      <w:pPr>
+        <w:ind w:left="1440" w:hanging="360"/>
+      </w:pPr>
+      <w:rPr>
+        <w:rFonts w:ascii="Courier New" w:hAnsi="Courier New" w:cs="Courier New" w:hint="default"/>
+      </w:rPr>
+    </w:lvl>
+    <w:lvl w:ilvl="1" w:tplc="2C0A0003" w:tentative="1">
+      <w:start w:val="1"/>
+      <w:numFmt w:val="bullet"/>
+      <w:lvlText w:val="o"/>
+      <w:lvlJc w:val="left"/>
+      <w:pPr>
+        <w:ind w:left="2160" w:hanging="360"/>
+      </w:pPr>
+      <w:rPr>
+        <w:rFonts w:ascii="Courier New" w:hAnsi="Courier New" w:cs="Courier New" w:hint="default"/>
+      </w:rPr>
+    </w:lvl>
+    <w:lvl w:ilvl="2" w:tplc="2C0A0005" w:tentative="1">
+      <w:start w:val="1"/>
+      <w:numFmt w:val="bullet"/>
+      <w:lvlText w:val=""/>
+      <w:lvlJc w:val="left"/>
+      <w:pPr>
+        <w:ind w:left="2880" w:hanging="360"/>
+      </w:pPr>
+      <w:rPr>
+        <w:rFonts w:ascii="Wingdings" w:hAnsi="Wingdings" w:hint="default"/>
+      </w:rPr>
+    </w:lvl>
+    <w:lvl w:ilvl="3" w:tplc="2C0A0001" w:tentative="1">
+      <w:start w:val="1"/>
+      <w:numFmt w:val="bullet"/>
+      <w:lvlText w:val=""/>
+      <w:lvlJc w:val="left"/>
+      <w:pPr>
+        <w:ind w:left="3600" w:hanging="360"/>
+      </w:pPr>
+      <w:rPr>
+        <w:rFonts w:ascii="Symbol" w:hAnsi="Symbol" w:hint="default"/>
+      </w:rPr>
+    </w:lvl>
+    <w:lvl w:ilvl="4" w:tplc="2C0A0003" w:tentative="1">
+      <w:start w:val="1"/>
+      <w:numFmt w:val="bullet"/>
+      <w:lvlText w:val="o"/>
+      <w:lvlJc w:val="left"/>
+      <w:pPr>
+        <w:ind w:left="4320" w:hanging="360"/>
+      </w:pPr>
+      <w:rPr>
+        <w:rFonts w:ascii="Courier New" w:hAnsi="Courier New" w:cs="Courier New" w:hint="default"/>
+      </w:rPr>
+    </w:lvl>
+    <w:lvl w:ilvl="5" w:tplc="2C0A0005" w:tentative="1">
+      <w:start w:val="1"/>
+      <w:numFmt w:val="bullet"/>
+      <w:lvlText w:val=""/>
+      <w:lvlJc w:val="left"/>
+      <w:pPr>
+        <w:ind w:left="5040" w:hanging="360"/>
+      </w:pPr>
+      <w:rPr>
+        <w:rFonts w:ascii="Wingdings" w:hAnsi="Wingdings" w:hint="default"/>
+      </w:rPr>
+    </w:lvl>
+    <w:lvl w:ilvl="6" w:tplc="2C0A0001" w:tentative="1">
+      <w:start w:val="1"/>
+      <w:numFmt w:val="bullet"/>
+      <w:lvlText w:val=""/>
+      <w:lvlJc w:val="left"/>
+      <w:pPr>
+        <w:ind w:left="5760" w:hanging="360"/>
+      </w:pPr>
+      <w:rPr>
+        <w:rFonts w:ascii="Symbol" w:hAnsi="Symbol" w:hint="default"/>
+      </w:rPr>
+    </w:lvl>
+    <w:lvl w:ilvl="7" w:tplc="2C0A0003" w:tentative="1">
+      <w:start w:val="1"/>
+      <w:numFmt w:val="bullet"/>
+      <w:lvlText w:val="o"/>
+      <w:lvlJc w:val="left"/>
+      <w:pPr>
+        <w:ind w:left="6480" w:hanging="360"/>
+      </w:pPr>
+      <w:rPr>
+        <w:rFonts w:ascii="Courier New" w:hAnsi="Courier New" w:cs="Courier New" w:hint="default"/>
+      </w:rPr>
+    </w:lvl>
+    <w:lvl w:ilvl="8" w:tplc="2C0A0005" w:tentative="1">
+      <w:start w:val="1"/>
+      <w:numFmt w:val="bullet"/>
+      <w:lvlText w:val=""/>
+      <w:lvlJc w:val="left"/>
+      <w:pPr>
+        <w:ind w:left="7200" w:hanging="360"/>
+      </w:pPr>
+      <w:rPr>
+        <w:rFonts w:ascii="Wingdings" w:hAnsi="Wingdings" w:hint="default"/>
+      </w:rPr>
+    </w:lvl>
+  </w:abstractNum>
   <w:num w:numId="1">
+    <w:abstractNumId w:val="2"/>
+  </w:num>
+  <w:num w:numId="2">
     <w:abstractNumId w:val="1"/>
   </w:num>
-  <w:num w:numId="2">
+  <w:num w:numId="3">
+    <w:abstractNumId w:val="3"/>
+  </w:num>
+  <w:num w:numId="4">
     <w:abstractNumId w:val="0"/>
   </w:num>
 </w:numbering>

</xml_diff>

<commit_message>
Entrega 4 PDF completo
</commit_message>
<xml_diff>
--- a/documentación/Documentación Base de Datos To-BE.docx
+++ b/documentación/Documentación Base de Datos To-BE.docx
@@ -4,23 +4,40 @@
   <w:body>
     <w:p>
       <w:pPr>
+        <w:pStyle w:val="Ttulo"/>
         <w:jc w:val="center"/>
         <w:rPr>
-          <w:rFonts w:ascii="Arial" w:hAnsi="Arial" w:cs="Arial"/>
-          <w:sz w:val="24"/>
-          <w:szCs w:val="24"/>
+          <w:b/>
+          <w:bCs/>
           <w:lang w:val="es-ES"/>
         </w:rPr>
       </w:pPr>
-      <w:r>
-        <w:rPr>
-          <w:rFonts w:ascii="Arial" w:hAnsi="Arial" w:cs="Arial"/>
-          <w:sz w:val="24"/>
-          <w:szCs w:val="24"/>
+    </w:p>
+    <w:p>
+      <w:pPr>
+        <w:pStyle w:val="Ttulo"/>
+        <w:jc w:val="center"/>
+        <w:rPr>
+          <w:b/>
+          <w:bCs/>
           <w:lang w:val="es-ES"/>
         </w:rPr>
+      </w:pPr>
+      <w:r>
+        <w:rPr>
+          <w:b/>
+          <w:bCs/>
+          <w:lang w:val="es-ES"/>
+        </w:rPr>
         <w:t>Documentación Base de Datos To-BE</w:t>
       </w:r>
+    </w:p>
+    <w:p>
+      <w:pPr>
+        <w:rPr>
+          <w:lang w:val="es-ES"/>
+        </w:rPr>
+      </w:pPr>
     </w:p>
     <w:p>
       <w:pPr>
@@ -170,26 +187,50 @@
           <w:sz w:val="24"/>
           <w:szCs w:val="24"/>
         </w:rPr>
-        <w:t xml:space="preserve"> “C:\</w:t>
-      </w:r>
-      <w:proofErr w:type="spellStart"/>
-      <w:r>
-        <w:rPr>
-          <w:rFonts w:ascii="Arial" w:hAnsi="Arial" w:cs="Arial"/>
-          <w:sz w:val="24"/>
-          <w:szCs w:val="24"/>
-        </w:rPr>
-        <w:t>Program</w:t>
-      </w:r>
-      <w:proofErr w:type="spellEnd"/>
-      <w:r>
-        <w:rPr>
-          <w:rFonts w:ascii="Arial" w:hAnsi="Arial" w:cs="Arial"/>
-          <w:sz w:val="24"/>
-          <w:szCs w:val="24"/>
-        </w:rPr>
-        <w:t xml:space="preserve"> Files\Microsoft SQL Server”.</w:t>
-      </w:r>
+        <w:t xml:space="preserve"> </w:t>
+      </w:r>
+    </w:p>
+    <w:p>
+      <w:pPr>
+        <w:pStyle w:val="Prrafodelista"/>
+        <w:spacing w:after="200" w:line="276" w:lineRule="auto"/>
+        <w:rPr>
+          <w:rFonts w:ascii="Arial" w:hAnsi="Arial" w:cs="Arial"/>
+          <w:sz w:val="24"/>
+          <w:szCs w:val="24"/>
+          <w:lang w:val="en-US"/>
+        </w:rPr>
+      </w:pPr>
+      <w:r>
+        <w:rPr>
+          <w:rFonts w:ascii="Arial" w:hAnsi="Arial" w:cs="Arial"/>
+          <w:sz w:val="24"/>
+          <w:szCs w:val="24"/>
+          <w:lang w:val="en-US"/>
+        </w:rPr>
+        <w:t>C:\Program Files\Microsoft SQL Serve</w:t>
+      </w:r>
+      <w:r>
+        <w:rPr>
+          <w:rFonts w:ascii="Arial" w:hAnsi="Arial" w:cs="Arial"/>
+          <w:sz w:val="24"/>
+          <w:szCs w:val="24"/>
+          <w:lang w:val="en-US"/>
+        </w:rPr>
+        <w:t>r</w:t>
+      </w:r>
+    </w:p>
+    <w:p>
+      <w:pPr>
+        <w:pStyle w:val="Prrafodelista"/>
+        <w:spacing w:after="200" w:line="276" w:lineRule="auto"/>
+        <w:rPr>
+          <w:rFonts w:ascii="Arial" w:hAnsi="Arial" w:cs="Arial"/>
+          <w:sz w:val="24"/>
+          <w:szCs w:val="24"/>
+          <w:lang w:val="en-US"/>
+        </w:rPr>
+      </w:pPr>
     </w:p>
     <w:p>
       <w:pPr>
@@ -237,17 +278,41 @@
           <w:szCs w:val="24"/>
           <w:lang w:val="en-US"/>
         </w:rPr>
-        <w:t xml:space="preserve"> “C:\Program Files\Microsoft SQL Server\MSSQL16.SQLEXPRESS\MSSQL\DATA”</w:t>
-      </w:r>
-      <w:r>
+        <w:t xml:space="preserve"> </w:t>
+      </w:r>
+    </w:p>
+    <w:p>
+      <w:pPr>
+        <w:pStyle w:val="Prrafodelista"/>
+        <w:spacing w:after="200" w:line="276" w:lineRule="auto"/>
         <w:rPr>
           <w:rFonts w:ascii="Arial" w:hAnsi="Arial" w:cs="Arial"/>
           <w:sz w:val="24"/>
           <w:szCs w:val="24"/>
           <w:lang w:val="en-US"/>
         </w:rPr>
-        <w:t>.</w:t>
-      </w:r>
+      </w:pPr>
+      <w:r>
+        <w:rPr>
+          <w:rFonts w:ascii="Arial" w:hAnsi="Arial" w:cs="Arial"/>
+          <w:sz w:val="24"/>
+          <w:szCs w:val="24"/>
+          <w:lang w:val="en-US"/>
+        </w:rPr>
+        <w:t>C:\Program Files\Microsoft SQL Server\MSSQL16.SQLEXPRESS\MSSQL\DATA</w:t>
+      </w:r>
+    </w:p>
+    <w:p>
+      <w:pPr>
+        <w:pStyle w:val="Prrafodelista"/>
+        <w:spacing w:after="200" w:line="276" w:lineRule="auto"/>
+        <w:rPr>
+          <w:rFonts w:ascii="Arial" w:hAnsi="Arial" w:cs="Arial"/>
+          <w:sz w:val="24"/>
+          <w:szCs w:val="24"/>
+          <w:lang w:val="en-US"/>
+        </w:rPr>
+      </w:pPr>
     </w:p>
     <w:p>
       <w:pPr>
@@ -331,6 +396,17 @@
     <w:p>
       <w:pPr>
         <w:pStyle w:val="Prrafodelista"/>
+        <w:spacing w:after="200" w:line="276" w:lineRule="auto"/>
+        <w:rPr>
+          <w:rFonts w:ascii="Arial" w:hAnsi="Arial" w:cs="Arial"/>
+          <w:sz w:val="24"/>
+          <w:szCs w:val="24"/>
+        </w:rPr>
+      </w:pPr>
+    </w:p>
+    <w:p>
+      <w:pPr>
+        <w:pStyle w:val="Prrafodelista"/>
         <w:numPr>
           <w:ilvl w:val="0"/>
           <w:numId w:val="2"/>
@@ -358,26 +434,41 @@
           <w:sz w:val="24"/>
           <w:szCs w:val="24"/>
         </w:rPr>
-        <w:t xml:space="preserve"> “C:\</w:t>
-      </w:r>
-      <w:proofErr w:type="spellStart"/>
-      <w:r>
-        <w:rPr>
-          <w:rFonts w:ascii="Arial" w:hAnsi="Arial" w:cs="Arial"/>
-          <w:sz w:val="24"/>
-          <w:szCs w:val="24"/>
-        </w:rPr>
-        <w:t>Program</w:t>
-      </w:r>
-      <w:proofErr w:type="spellEnd"/>
-      <w:r>
-        <w:rPr>
-          <w:rFonts w:ascii="Arial" w:hAnsi="Arial" w:cs="Arial"/>
-          <w:sz w:val="24"/>
-          <w:szCs w:val="24"/>
-        </w:rPr>
-        <w:t xml:space="preserve"> Files\Microsoft SQL Server\MSSQL16.SQLEXPRESS\MSSQL\DATA”.</w:t>
-      </w:r>
+        <w:t xml:space="preserve"> </w:t>
+      </w:r>
+    </w:p>
+    <w:p>
+      <w:pPr>
+        <w:pStyle w:val="Prrafodelista"/>
+        <w:spacing w:after="200" w:line="276" w:lineRule="auto"/>
+        <w:rPr>
+          <w:rFonts w:ascii="Arial" w:hAnsi="Arial" w:cs="Arial"/>
+          <w:sz w:val="24"/>
+          <w:szCs w:val="24"/>
+          <w:lang w:val="en-US"/>
+        </w:rPr>
+      </w:pPr>
+      <w:r>
+        <w:rPr>
+          <w:rFonts w:ascii="Arial" w:hAnsi="Arial" w:cs="Arial"/>
+          <w:sz w:val="24"/>
+          <w:szCs w:val="24"/>
+          <w:lang w:val="en-US"/>
+        </w:rPr>
+        <w:t>C:\Program Files\Microsoft SQL Server\MSSQL16.SQLEXPRESS\MSSQL\DATA</w:t>
+      </w:r>
+    </w:p>
+    <w:p>
+      <w:pPr>
+        <w:pStyle w:val="Prrafodelista"/>
+        <w:spacing w:after="200" w:line="276" w:lineRule="auto"/>
+        <w:rPr>
+          <w:rFonts w:ascii="Arial" w:hAnsi="Arial" w:cs="Arial"/>
+          <w:sz w:val="24"/>
+          <w:szCs w:val="24"/>
+          <w:lang w:val="en-US"/>
+        </w:rPr>
+      </w:pPr>
     </w:p>
     <w:p>
       <w:pPr>
@@ -433,6 +524,17 @@
     <w:p>
       <w:pPr>
         <w:pStyle w:val="Prrafodelista"/>
+        <w:spacing w:after="200" w:line="276" w:lineRule="auto"/>
+        <w:rPr>
+          <w:rFonts w:ascii="Arial" w:hAnsi="Arial" w:cs="Arial"/>
+          <w:sz w:val="24"/>
+          <w:szCs w:val="24"/>
+        </w:rPr>
+      </w:pPr>
+    </w:p>
+    <w:p>
+      <w:pPr>
+        <w:pStyle w:val="Prrafodelista"/>
         <w:numPr>
           <w:ilvl w:val="0"/>
           <w:numId w:val="2"/>
@@ -556,72 +658,20 @@
           <w:sz w:val="24"/>
           <w:szCs w:val="24"/>
         </w:rPr>
-        <w:t xml:space="preserve">: </w:t>
-      </w:r>
-      <w:r>
-        <w:rPr>
-          <w:rFonts w:ascii="Arial" w:hAnsi="Arial" w:cs="Arial"/>
-          <w:sz w:val="24"/>
-          <w:szCs w:val="24"/>
-        </w:rPr>
-        <w:t>2</w:t>
-      </w:r>
-      <w:r>
-        <w:rPr>
-          <w:rFonts w:ascii="Arial" w:hAnsi="Arial" w:cs="Arial"/>
-          <w:sz w:val="24"/>
-          <w:szCs w:val="24"/>
-        </w:rPr>
-        <w:t>.</w:t>
-      </w:r>
-      <w:r>
-        <w:rPr>
-          <w:rFonts w:ascii="Arial" w:hAnsi="Arial" w:cs="Arial"/>
-          <w:sz w:val="24"/>
-          <w:szCs w:val="24"/>
-        </w:rPr>
-        <w:t>147</w:t>
-      </w:r>
-      <w:r>
-        <w:rPr>
-          <w:rFonts w:ascii="Arial" w:hAnsi="Arial" w:cs="Arial"/>
-          <w:sz w:val="24"/>
-          <w:szCs w:val="24"/>
-        </w:rPr>
-        <w:t>.</w:t>
-      </w:r>
-      <w:r>
-        <w:rPr>
-          <w:rFonts w:ascii="Arial" w:hAnsi="Arial" w:cs="Arial"/>
-          <w:sz w:val="24"/>
-          <w:szCs w:val="24"/>
-        </w:rPr>
-        <w:t>483</w:t>
-      </w:r>
-      <w:r>
-        <w:rPr>
-          <w:rFonts w:ascii="Arial" w:hAnsi="Arial" w:cs="Arial"/>
-          <w:sz w:val="24"/>
-          <w:szCs w:val="24"/>
-        </w:rPr>
-        <w:t>.</w:t>
-      </w:r>
-      <w:r>
-        <w:rPr>
-          <w:rFonts w:ascii="Arial" w:hAnsi="Arial" w:cs="Arial"/>
-          <w:sz w:val="24"/>
-          <w:szCs w:val="24"/>
-        </w:rPr>
-        <w:t>647</w:t>
-      </w:r>
-      <w:r>
-        <w:rPr>
-          <w:rFonts w:ascii="Arial" w:hAnsi="Arial" w:cs="Arial"/>
-          <w:sz w:val="24"/>
-          <w:szCs w:val="24"/>
-        </w:rPr>
-        <w:t xml:space="preserve"> MB</w:t>
-      </w:r>
+        <w:t>: 2.147.483.647 MB</w:t>
+      </w:r>
+    </w:p>
+    <w:p>
+      <w:pPr>
+        <w:pStyle w:val="Prrafodelista"/>
+        <w:spacing w:after="200" w:line="276" w:lineRule="auto"/>
+        <w:ind w:left="1440"/>
+        <w:rPr>
+          <w:rFonts w:ascii="Arial" w:hAnsi="Arial" w:cs="Arial"/>
+          <w:sz w:val="24"/>
+          <w:szCs w:val="24"/>
+        </w:rPr>
+      </w:pPr>
     </w:p>
     <w:p>
       <w:pPr>
@@ -646,17 +696,7 @@
           <w:sz w:val="24"/>
           <w:szCs w:val="24"/>
         </w:rPr>
-        <w:t>C</w:t>
-      </w:r>
-      <w:r>
-        <w:rPr>
-          <w:rFonts w:ascii="Arial" w:hAnsi="Arial" w:cs="Arial"/>
-          <w:b/>
-          <w:bCs/>
-          <w:sz w:val="24"/>
-          <w:szCs w:val="24"/>
-        </w:rPr>
-        <w:t>onfiguraci</w:t>
+        <w:t>Configuraci</w:t>
       </w:r>
       <w:r>
         <w:rPr>
@@ -734,6 +774,18 @@
     <w:p>
       <w:pPr>
         <w:pStyle w:val="Prrafodelista"/>
+        <w:spacing w:after="200" w:line="276" w:lineRule="auto"/>
+        <w:ind w:left="1440"/>
+        <w:rPr>
+          <w:rFonts w:ascii="Arial" w:hAnsi="Arial" w:cs="Arial"/>
+          <w:sz w:val="24"/>
+          <w:szCs w:val="24"/>
+        </w:rPr>
+      </w:pPr>
+    </w:p>
+    <w:p>
+      <w:pPr>
+        <w:pStyle w:val="Prrafodelista"/>
         <w:numPr>
           <w:ilvl w:val="0"/>
           <w:numId w:val="2"/>
@@ -872,17 +924,21 @@
           <w:szCs w:val="24"/>
           <w:lang w:val="es-ES"/>
         </w:rPr>
-        <w:t xml:space="preserve"> inicios de sesión erróneo</w:t>
-      </w:r>
-      <w:r>
+        <w:t xml:space="preserve"> inicios de sesión erróneos</w:t>
+      </w:r>
+    </w:p>
+    <w:p>
+      <w:pPr>
+        <w:pStyle w:val="Prrafodelista"/>
+        <w:spacing w:after="200" w:line="276" w:lineRule="auto"/>
+        <w:ind w:left="1440"/>
         <w:rPr>
           <w:rFonts w:ascii="Arial" w:hAnsi="Arial" w:cs="Arial"/>
           <w:sz w:val="24"/>
           <w:szCs w:val="24"/>
           <w:lang w:val="es-ES"/>
         </w:rPr>
-        <w:t>s</w:t>
-      </w:r>
+      </w:pPr>
     </w:p>
     <w:p>
       <w:pPr>
@@ -984,6 +1040,17 @@
     <w:p>
       <w:pPr>
         <w:pStyle w:val="Prrafodelista"/>
+        <w:spacing w:after="200" w:line="276" w:lineRule="auto"/>
+        <w:rPr>
+          <w:rFonts w:ascii="Arial" w:hAnsi="Arial" w:cs="Arial"/>
+          <w:sz w:val="24"/>
+          <w:szCs w:val="24"/>
+        </w:rPr>
+      </w:pPr>
+    </w:p>
+    <w:p>
+      <w:pPr>
+        <w:pStyle w:val="Prrafodelista"/>
         <w:numPr>
           <w:ilvl w:val="0"/>
           <w:numId w:val="2"/>
@@ -1037,6 +1104,17 @@
     <w:p>
       <w:pPr>
         <w:pStyle w:val="Prrafodelista"/>
+        <w:spacing w:after="200" w:line="276" w:lineRule="auto"/>
+        <w:rPr>
+          <w:rFonts w:ascii="Arial" w:hAnsi="Arial" w:cs="Arial"/>
+          <w:sz w:val="24"/>
+          <w:szCs w:val="24"/>
+        </w:rPr>
+      </w:pPr>
+    </w:p>
+    <w:p>
+      <w:pPr>
+        <w:pStyle w:val="Prrafodelista"/>
         <w:numPr>
           <w:ilvl w:val="0"/>
           <w:numId w:val="2"/>
@@ -1066,8 +1144,61 @@
           <w:sz w:val="24"/>
           <w:szCs w:val="24"/>
         </w:rPr>
-        <w:t xml:space="preserve"> </w:t>
-      </w:r>
+        <w:t xml:space="preserve">: </w:t>
+      </w:r>
+      <w:r>
+        <w:rPr>
+          <w:rFonts w:ascii="Arial" w:hAnsi="Arial" w:cs="Arial"/>
+          <w:sz w:val="24"/>
+          <w:szCs w:val="24"/>
+        </w:rPr>
+        <w:t>192.168.254.254</w:t>
+      </w:r>
+    </w:p>
+    <w:p>
+      <w:pPr>
+        <w:pStyle w:val="Prrafodelista"/>
+        <w:spacing w:after="200" w:line="276" w:lineRule="auto"/>
+        <w:rPr>
+          <w:rFonts w:ascii="Arial" w:hAnsi="Arial" w:cs="Arial"/>
+          <w:sz w:val="24"/>
+          <w:szCs w:val="24"/>
+        </w:rPr>
+      </w:pPr>
+    </w:p>
+    <w:p>
+      <w:pPr>
+        <w:pStyle w:val="Prrafodelista"/>
+        <w:spacing w:after="200" w:line="276" w:lineRule="auto"/>
+        <w:rPr>
+          <w:rFonts w:ascii="Arial" w:hAnsi="Arial" w:cs="Arial"/>
+          <w:sz w:val="24"/>
+          <w:szCs w:val="24"/>
+        </w:rPr>
+      </w:pPr>
+    </w:p>
+    <w:p>
+      <w:pPr>
+        <w:pStyle w:val="Prrafodelista"/>
+        <w:spacing w:after="200" w:line="276" w:lineRule="auto"/>
+        <w:rPr>
+          <w:rFonts w:ascii="Arial" w:hAnsi="Arial" w:cs="Arial"/>
+          <w:sz w:val="24"/>
+          <w:szCs w:val="24"/>
+        </w:rPr>
+      </w:pPr>
+    </w:p>
+    <w:p>
+      <w:pPr>
+        <w:pStyle w:val="Prrafodelista"/>
+        <w:rPr>
+          <w:rFonts w:ascii="Arial" w:hAnsi="Arial" w:cs="Arial"/>
+          <w:b/>
+          <w:bCs/>
+          <w:sz w:val="24"/>
+          <w:szCs w:val="24"/>
+        </w:rPr>
+      </w:pPr>
     </w:p>
     <w:p>
       <w:pPr>
@@ -1107,6 +1238,10 @@
     <w:p>
       <w:pPr>
         <w:pStyle w:val="Prrafodelista"/>
+        <w:numPr>
+          <w:ilvl w:val="0"/>
+          <w:numId w:val="5"/>
+        </w:numPr>
         <w:spacing w:after="200" w:line="276" w:lineRule="auto"/>
         <w:rPr>
           <w:rFonts w:ascii="Arial" w:hAnsi="Arial" w:cs="Arial"/>
@@ -1126,41 +1261,33 @@
     <w:p>
       <w:pPr>
         <w:pStyle w:val="Prrafodelista"/>
-        <w:spacing w:after="200" w:line="276" w:lineRule="auto"/>
-        <w:rPr>
-          <w:rFonts w:ascii="Arial" w:hAnsi="Arial" w:cs="Arial"/>
-          <w:sz w:val="24"/>
-          <w:szCs w:val="24"/>
-        </w:rPr>
-      </w:pPr>
-      <w:r>
-        <w:rPr>
-          <w:rFonts w:ascii="Arial" w:hAnsi="Arial" w:cs="Arial"/>
-          <w:sz w:val="24"/>
-          <w:szCs w:val="24"/>
-        </w:rPr>
-        <w:t>NOMBRE_</w:t>
-      </w:r>
-      <w:r>
-        <w:rPr>
-          <w:rFonts w:ascii="Arial" w:hAnsi="Arial" w:cs="Arial"/>
-          <w:sz w:val="24"/>
-          <w:szCs w:val="24"/>
-        </w:rPr>
-        <w:t>MOSTRAR:</w:t>
-      </w:r>
-      <w:r>
-        <w:rPr>
-          <w:rFonts w:ascii="Arial" w:hAnsi="Arial" w:cs="Arial"/>
-          <w:sz w:val="24"/>
-          <w:szCs w:val="24"/>
-        </w:rPr>
-        <w:t xml:space="preserve"> SQL Server (SQLEXPRESS)</w:t>
-      </w:r>
-    </w:p>
-    <w:p>
-      <w:pPr>
-        <w:pStyle w:val="Prrafodelista"/>
+        <w:numPr>
+          <w:ilvl w:val="0"/>
+          <w:numId w:val="5"/>
+        </w:numPr>
+        <w:spacing w:after="200" w:line="276" w:lineRule="auto"/>
+        <w:rPr>
+          <w:rFonts w:ascii="Arial" w:hAnsi="Arial" w:cs="Arial"/>
+          <w:sz w:val="24"/>
+          <w:szCs w:val="24"/>
+        </w:rPr>
+      </w:pPr>
+      <w:r>
+        <w:rPr>
+          <w:rFonts w:ascii="Arial" w:hAnsi="Arial" w:cs="Arial"/>
+          <w:sz w:val="24"/>
+          <w:szCs w:val="24"/>
+        </w:rPr>
+        <w:t>NOMBRE_MOSTRAR: SQL Server (SQLEXPRESS)</w:t>
+      </w:r>
+    </w:p>
+    <w:p>
+      <w:pPr>
+        <w:pStyle w:val="Prrafodelista"/>
+        <w:numPr>
+          <w:ilvl w:val="0"/>
+          <w:numId w:val="5"/>
+        </w:numPr>
         <w:spacing w:after="200" w:line="276" w:lineRule="auto"/>
         <w:rPr>
           <w:rFonts w:ascii="Arial" w:hAnsi="Arial" w:cs="Arial"/>
@@ -1180,36 +1307,24 @@
     <w:p>
       <w:pPr>
         <w:pStyle w:val="Prrafodelista"/>
-        <w:spacing w:after="200" w:line="276" w:lineRule="auto"/>
-        <w:rPr>
-          <w:rFonts w:ascii="Arial" w:hAnsi="Arial" w:cs="Arial"/>
-          <w:sz w:val="24"/>
-          <w:szCs w:val="24"/>
-        </w:rPr>
-      </w:pPr>
-      <w:r>
-        <w:rPr>
-          <w:rFonts w:ascii="Arial" w:hAnsi="Arial" w:cs="Arial"/>
-          <w:sz w:val="24"/>
-          <w:szCs w:val="24"/>
-        </w:rPr>
-        <w:t>NOMBRE_</w:t>
-      </w:r>
-      <w:r>
-        <w:rPr>
-          <w:rFonts w:ascii="Arial" w:hAnsi="Arial" w:cs="Arial"/>
-          <w:sz w:val="24"/>
-          <w:szCs w:val="24"/>
-        </w:rPr>
-        <w:t>MOSTRAR:</w:t>
-      </w:r>
-      <w:r>
-        <w:rPr>
-          <w:rFonts w:ascii="Arial" w:hAnsi="Arial" w:cs="Arial"/>
-          <w:sz w:val="24"/>
-          <w:szCs w:val="24"/>
-        </w:rPr>
-        <w:t xml:space="preserve"> SQL Server CEIP </w:t>
+        <w:numPr>
+          <w:ilvl w:val="0"/>
+          <w:numId w:val="5"/>
+        </w:numPr>
+        <w:spacing w:after="200" w:line="276" w:lineRule="auto"/>
+        <w:rPr>
+          <w:rFonts w:ascii="Arial" w:hAnsi="Arial" w:cs="Arial"/>
+          <w:sz w:val="24"/>
+          <w:szCs w:val="24"/>
+        </w:rPr>
+      </w:pPr>
+      <w:r>
+        <w:rPr>
+          <w:rFonts w:ascii="Arial" w:hAnsi="Arial" w:cs="Arial"/>
+          <w:sz w:val="24"/>
+          <w:szCs w:val="24"/>
+        </w:rPr>
+        <w:t xml:space="preserve">NOMBRE_MOSTRAR: SQL Server CEIP </w:t>
       </w:r>
       <w:proofErr w:type="spellStart"/>
       <w:r>
@@ -1233,6 +1348,10 @@
     <w:p>
       <w:pPr>
         <w:pStyle w:val="Prrafodelista"/>
+        <w:numPr>
+          <w:ilvl w:val="0"/>
+          <w:numId w:val="5"/>
+        </w:numPr>
         <w:spacing w:after="200" w:line="276" w:lineRule="auto"/>
         <w:rPr>
           <w:rFonts w:ascii="Arial" w:hAnsi="Arial" w:cs="Arial"/>
@@ -1262,36 +1381,24 @@
     <w:p>
       <w:pPr>
         <w:pStyle w:val="Prrafodelista"/>
-        <w:spacing w:after="200" w:line="276" w:lineRule="auto"/>
-        <w:rPr>
-          <w:rFonts w:ascii="Arial" w:hAnsi="Arial" w:cs="Arial"/>
-          <w:sz w:val="24"/>
-          <w:szCs w:val="24"/>
-        </w:rPr>
-      </w:pPr>
-      <w:r>
-        <w:rPr>
-          <w:rFonts w:ascii="Arial" w:hAnsi="Arial" w:cs="Arial"/>
-          <w:sz w:val="24"/>
-          <w:szCs w:val="24"/>
-        </w:rPr>
-        <w:t>NOMBRE_</w:t>
-      </w:r>
-      <w:r>
-        <w:rPr>
-          <w:rFonts w:ascii="Arial" w:hAnsi="Arial" w:cs="Arial"/>
-          <w:sz w:val="24"/>
-          <w:szCs w:val="24"/>
-        </w:rPr>
-        <w:t>MOSTRAR:</w:t>
-      </w:r>
-      <w:r>
-        <w:rPr>
-          <w:rFonts w:ascii="Arial" w:hAnsi="Arial" w:cs="Arial"/>
-          <w:sz w:val="24"/>
-          <w:szCs w:val="24"/>
-        </w:rPr>
-        <w:t xml:space="preserve"> SQL Server VSS </w:t>
+        <w:numPr>
+          <w:ilvl w:val="0"/>
+          <w:numId w:val="5"/>
+        </w:numPr>
+        <w:spacing w:after="200" w:line="276" w:lineRule="auto"/>
+        <w:rPr>
+          <w:rFonts w:ascii="Arial" w:hAnsi="Arial" w:cs="Arial"/>
+          <w:sz w:val="24"/>
+          <w:szCs w:val="24"/>
+        </w:rPr>
+      </w:pPr>
+      <w:r>
+        <w:rPr>
+          <w:rFonts w:ascii="Arial" w:hAnsi="Arial" w:cs="Arial"/>
+          <w:sz w:val="24"/>
+          <w:szCs w:val="24"/>
+        </w:rPr>
+        <w:t xml:space="preserve">NOMBRE_MOSTRAR: SQL Server VSS </w:t>
       </w:r>
       <w:proofErr w:type="spellStart"/>
       <w:r>
@@ -1303,6 +1410,18 @@
         <w:t>Writer</w:t>
       </w:r>
       <w:proofErr w:type="spellEnd"/>
+    </w:p>
+    <w:p>
+      <w:pPr>
+        <w:pStyle w:val="Prrafodelista"/>
+        <w:spacing w:after="200" w:line="276" w:lineRule="auto"/>
+        <w:ind w:left="1440"/>
+        <w:rPr>
+          <w:rFonts w:ascii="Arial" w:hAnsi="Arial" w:cs="Arial"/>
+          <w:sz w:val="24"/>
+          <w:szCs w:val="24"/>
+        </w:rPr>
+      </w:pPr>
     </w:p>
     <w:p>
       <w:pPr>
@@ -1335,9 +1454,336 @@
           <w:bCs/>
           <w:sz w:val="24"/>
           <w:szCs w:val="24"/>
+          <w:lang w:val="en-US"/>
+        </w:rPr>
+        <w:t>:</w:t>
+      </w:r>
+    </w:p>
+    <w:p>
+      <w:pPr>
+        <w:pStyle w:val="Prrafodelista"/>
+        <w:numPr>
+          <w:ilvl w:val="0"/>
+          <w:numId w:val="6"/>
+        </w:numPr>
+        <w:spacing w:after="200" w:line="276" w:lineRule="auto"/>
+        <w:rPr>
+          <w:rFonts w:ascii="Arial" w:hAnsi="Arial" w:cs="Arial"/>
+          <w:sz w:val="24"/>
+          <w:szCs w:val="24"/>
+        </w:rPr>
+      </w:pPr>
+      <w:proofErr w:type="spellStart"/>
+      <w:r>
+        <w:rPr>
+          <w:rFonts w:ascii="Arial" w:hAnsi="Arial" w:cs="Arial"/>
+          <w:sz w:val="24"/>
+          <w:szCs w:val="24"/>
+        </w:rPr>
+        <w:t>Replicaci</w:t>
+      </w:r>
+      <w:r>
+        <w:rPr>
+          <w:rFonts w:ascii="Arial" w:hAnsi="Arial" w:cs="Arial"/>
+          <w:sz w:val="24"/>
+          <w:szCs w:val="24"/>
+          <w:lang w:val="es-ES"/>
+        </w:rPr>
+        <w:t>ón</w:t>
+      </w:r>
+      <w:proofErr w:type="spellEnd"/>
+      <w:r>
+        <w:rPr>
+          <w:rFonts w:ascii="Arial" w:hAnsi="Arial" w:cs="Arial"/>
+          <w:sz w:val="24"/>
+          <w:szCs w:val="24"/>
+          <w:lang w:val="es-ES"/>
+        </w:rPr>
+        <w:t xml:space="preserve"> de SQL Server</w:t>
+      </w:r>
+      <w:r>
+        <w:rPr>
+          <w:rFonts w:ascii="Arial" w:hAnsi="Arial" w:cs="Arial"/>
+          <w:sz w:val="24"/>
+          <w:szCs w:val="24"/>
+        </w:rPr>
+        <w:t xml:space="preserve">: </w:t>
+      </w:r>
+      <w:r>
+        <w:rPr>
+          <w:rFonts w:ascii="Arial" w:hAnsi="Arial" w:cs="Arial"/>
+          <w:b/>
+          <w:bCs/>
+          <w:sz w:val="24"/>
+          <w:szCs w:val="24"/>
+        </w:rPr>
+        <w:t>i</w:t>
+      </w:r>
+      <w:r>
+        <w:rPr>
+          <w:rFonts w:ascii="Arial" w:hAnsi="Arial" w:cs="Arial"/>
+          <w:b/>
+          <w:bCs/>
+          <w:sz w:val="24"/>
+          <w:szCs w:val="24"/>
+        </w:rPr>
+        <w:t>nstalado</w:t>
+      </w:r>
+    </w:p>
+    <w:p>
+      <w:pPr>
+        <w:pStyle w:val="Prrafodelista"/>
+        <w:numPr>
+          <w:ilvl w:val="0"/>
+          <w:numId w:val="6"/>
+        </w:numPr>
+        <w:spacing w:after="200" w:line="276" w:lineRule="auto"/>
+        <w:rPr>
+          <w:rFonts w:ascii="Arial" w:hAnsi="Arial" w:cs="Arial"/>
+          <w:sz w:val="24"/>
+          <w:szCs w:val="24"/>
+          <w:lang w:val="en-US"/>
+        </w:rPr>
+      </w:pPr>
+      <w:r>
+        <w:rPr>
+          <w:rFonts w:ascii="Arial" w:hAnsi="Arial" w:cs="Arial"/>
+          <w:sz w:val="24"/>
+          <w:szCs w:val="24"/>
+          <w:lang w:val="en-US"/>
+        </w:rPr>
+        <w:t xml:space="preserve">Machine Learning Services: </w:t>
+      </w:r>
+      <w:r>
+        <w:rPr>
+          <w:rFonts w:ascii="Arial" w:hAnsi="Arial" w:cs="Arial"/>
+          <w:b/>
+          <w:bCs/>
+          <w:sz w:val="24"/>
+          <w:szCs w:val="24"/>
+          <w:lang w:val="en-US"/>
+        </w:rPr>
+        <w:t xml:space="preserve">no </w:t>
+      </w:r>
+      <w:proofErr w:type="spellStart"/>
+      <w:r>
+        <w:rPr>
+          <w:rFonts w:ascii="Arial" w:hAnsi="Arial" w:cs="Arial"/>
+          <w:b/>
+          <w:bCs/>
+          <w:sz w:val="24"/>
+          <w:szCs w:val="24"/>
+          <w:lang w:val="en-US"/>
+        </w:rPr>
+        <w:t>instalad</w:t>
+      </w:r>
+      <w:r>
+        <w:rPr>
+          <w:rFonts w:ascii="Arial" w:hAnsi="Arial" w:cs="Arial"/>
+          <w:b/>
+          <w:bCs/>
+          <w:sz w:val="24"/>
+          <w:szCs w:val="24"/>
+          <w:lang w:val="en-US"/>
+        </w:rPr>
+        <w:t>o</w:t>
+      </w:r>
+      <w:proofErr w:type="spellEnd"/>
+    </w:p>
+    <w:p>
+      <w:pPr>
+        <w:pStyle w:val="Prrafodelista"/>
+        <w:numPr>
+          <w:ilvl w:val="0"/>
+          <w:numId w:val="6"/>
+        </w:numPr>
+        <w:spacing w:after="200" w:line="276" w:lineRule="auto"/>
+        <w:rPr>
+          <w:rFonts w:ascii="Arial" w:hAnsi="Arial" w:cs="Arial"/>
+          <w:sz w:val="24"/>
+          <w:szCs w:val="24"/>
+          <w:lang w:val="en-US"/>
+        </w:rPr>
+      </w:pPr>
+      <w:r>
+        <w:rPr>
+          <w:rFonts w:ascii="Arial" w:hAnsi="Arial" w:cs="Arial"/>
+          <w:sz w:val="24"/>
+          <w:szCs w:val="24"/>
+          <w:lang w:val="en-US"/>
+        </w:rPr>
+        <w:t>B</w:t>
+      </w:r>
+      <w:proofErr w:type="spellStart"/>
+      <w:r>
+        <w:rPr>
+          <w:rFonts w:ascii="Arial" w:hAnsi="Arial" w:cs="Arial"/>
+          <w:sz w:val="24"/>
+          <w:szCs w:val="24"/>
+          <w:lang w:val="es-ES"/>
+        </w:rPr>
+        <w:t>úsqueda</w:t>
+      </w:r>
+      <w:proofErr w:type="spellEnd"/>
+      <w:r>
+        <w:rPr>
+          <w:rFonts w:ascii="Arial" w:hAnsi="Arial" w:cs="Arial"/>
+          <w:sz w:val="24"/>
+          <w:szCs w:val="24"/>
+          <w:lang w:val="es-ES"/>
+        </w:rPr>
+        <w:t xml:space="preserve"> de texto completo</w:t>
+      </w:r>
+      <w:r>
+        <w:rPr>
+          <w:rFonts w:ascii="Arial" w:hAnsi="Arial" w:cs="Arial"/>
+          <w:sz w:val="24"/>
+          <w:szCs w:val="24"/>
+          <w:lang w:val="en-US"/>
+        </w:rPr>
+        <w:t xml:space="preserve">: </w:t>
+      </w:r>
+      <w:proofErr w:type="spellStart"/>
+      <w:r>
+        <w:rPr>
+          <w:rFonts w:ascii="Arial" w:hAnsi="Arial" w:cs="Arial"/>
+          <w:b/>
+          <w:bCs/>
+          <w:sz w:val="24"/>
+          <w:szCs w:val="24"/>
+          <w:lang w:val="en-US"/>
+        </w:rPr>
+        <w:t>instalado</w:t>
+      </w:r>
+      <w:proofErr w:type="spellEnd"/>
+    </w:p>
+    <w:p>
+      <w:pPr>
+        <w:pStyle w:val="Prrafodelista"/>
+        <w:numPr>
+          <w:ilvl w:val="0"/>
+          <w:numId w:val="6"/>
+        </w:numPr>
+        <w:spacing w:after="200" w:line="276" w:lineRule="auto"/>
+        <w:rPr>
+          <w:rFonts w:ascii="Arial" w:hAnsi="Arial" w:cs="Arial"/>
+          <w:sz w:val="24"/>
+          <w:szCs w:val="24"/>
+          <w:lang w:val="en-US"/>
+        </w:rPr>
+      </w:pPr>
+      <w:r>
+        <w:rPr>
+          <w:rFonts w:ascii="Arial" w:hAnsi="Arial" w:cs="Arial"/>
+          <w:sz w:val="24"/>
+          <w:szCs w:val="24"/>
+          <w:lang w:val="en-US"/>
+        </w:rPr>
+        <w:t xml:space="preserve">Data Quality Services: </w:t>
+      </w:r>
+      <w:r>
+        <w:rPr>
+          <w:rFonts w:ascii="Arial" w:hAnsi="Arial" w:cs="Arial"/>
+          <w:b/>
+          <w:bCs/>
+          <w:sz w:val="24"/>
+          <w:szCs w:val="24"/>
+          <w:lang w:val="en-US"/>
+        </w:rPr>
+        <w:t xml:space="preserve">no </w:t>
+      </w:r>
+      <w:proofErr w:type="spellStart"/>
+      <w:r>
+        <w:rPr>
+          <w:rFonts w:ascii="Arial" w:hAnsi="Arial" w:cs="Arial"/>
+          <w:b/>
+          <w:bCs/>
+          <w:sz w:val="24"/>
+          <w:szCs w:val="24"/>
+          <w:lang w:val="en-US"/>
+        </w:rPr>
+        <w:t>instalado</w:t>
+      </w:r>
+      <w:proofErr w:type="spellEnd"/>
+    </w:p>
+    <w:p>
+      <w:pPr>
+        <w:pStyle w:val="Prrafodelista"/>
+        <w:numPr>
+          <w:ilvl w:val="0"/>
+          <w:numId w:val="6"/>
+        </w:numPr>
+        <w:spacing w:after="200" w:line="276" w:lineRule="auto"/>
+        <w:rPr>
+          <w:rFonts w:ascii="Arial" w:hAnsi="Arial" w:cs="Arial"/>
+          <w:sz w:val="24"/>
+          <w:szCs w:val="24"/>
+        </w:rPr>
+      </w:pPr>
+      <w:r>
+        <w:rPr>
+          <w:rFonts w:ascii="Arial" w:hAnsi="Arial" w:cs="Arial"/>
+          <w:sz w:val="24"/>
+          <w:szCs w:val="24"/>
+        </w:rPr>
+        <w:t xml:space="preserve">Servicios de consultas de </w:t>
+      </w:r>
+      <w:proofErr w:type="spellStart"/>
+      <w:r>
+        <w:rPr>
+          <w:rFonts w:ascii="Arial" w:hAnsi="Arial" w:cs="Arial"/>
+          <w:sz w:val="24"/>
+          <w:szCs w:val="24"/>
+        </w:rPr>
+        <w:t>Pol</w:t>
+      </w:r>
+      <w:r>
+        <w:rPr>
+          <w:rFonts w:ascii="Arial" w:hAnsi="Arial" w:cs="Arial"/>
+          <w:sz w:val="24"/>
+          <w:szCs w:val="24"/>
+        </w:rPr>
+        <w:t>yBase</w:t>
+      </w:r>
+      <w:proofErr w:type="spellEnd"/>
+      <w:r>
+        <w:rPr>
+          <w:rFonts w:ascii="Arial" w:hAnsi="Arial" w:cs="Arial"/>
+          <w:sz w:val="24"/>
+          <w:szCs w:val="24"/>
+        </w:rPr>
+        <w:t xml:space="preserve"> para datos externos: </w:t>
+      </w:r>
+      <w:r>
+        <w:rPr>
+          <w:rFonts w:ascii="Arial" w:hAnsi="Arial" w:cs="Arial"/>
+          <w:b/>
+          <w:bCs/>
+          <w:sz w:val="24"/>
+          <w:szCs w:val="24"/>
+        </w:rPr>
+        <w:t>no instalado</w:t>
+      </w:r>
+      <w:r>
+        <w:rPr>
+          <w:rFonts w:ascii="Arial" w:hAnsi="Arial" w:cs="Arial"/>
+          <w:sz w:val="24"/>
+          <w:szCs w:val="24"/>
         </w:rPr>
         <w:t xml:space="preserve"> </w:t>
       </w:r>
+    </w:p>
+    <w:p>
+      <w:pPr>
+        <w:pStyle w:val="Prrafodelista"/>
+        <w:spacing w:after="200" w:line="276" w:lineRule="auto"/>
+        <w:ind w:left="1440"/>
+        <w:rPr>
+          <w:rFonts w:ascii="Arial" w:hAnsi="Arial" w:cs="Arial"/>
+          <w:sz w:val="24"/>
+          <w:szCs w:val="24"/>
+        </w:rPr>
+      </w:pPr>
     </w:p>
     <w:p>
       <w:pPr>
@@ -1419,6 +1865,7 @@
       </w:r>
     </w:p>
     <w:sectPr>
+      <w:headerReference w:type="default" r:id="rId7"/>
       <w:pgSz w:w="11906" w:h="16838"/>
       <w:pgMar w:top="1417" w:right="1701" w:bottom="1417" w:left="1701" w:header="708" w:footer="708" w:gutter="0"/>
       <w:cols w:space="708"/>
@@ -1428,6 +1875,232 @@
 </w:document>
 </file>
 
+<file path=word/endnotes.xml><?xml version="1.0" encoding="utf-8"?>
+<w:endnotes xmlns:wpc="http://schemas.microsoft.com/office/word/2010/wordprocessingCanvas" xmlns:cx="http://schemas.microsoft.com/office/drawing/2014/chartex" xmlns:cx1="http://schemas.microsoft.com/office/drawing/2015/9/8/chartex" xmlns:cx2="http://schemas.microsoft.com/office/drawing/2015/10/21/chartex" xmlns:cx3="http://schemas.microsoft.com/office/drawing/2016/5/9/chartex" xmlns:cx4="http://schemas.microsoft.com/office/drawing/2016/5/10/chartex" xmlns:cx5="http://schemas.microsoft.com/office/drawing/2016/5/11/chartex" xmlns:cx6="http://schemas.microsoft.com/office/drawing/2016/5/12/chartex" xmlns:cx7="http://schemas.microsoft.com/office/drawing/2016/5/13/chartex" xmlns:cx8="http://schemas.microsoft.com/office/drawing/2016/5/14/chartex" xmlns:mc="http://schemas.openxmlformats.org/markup-compatibility/2006" xmlns:aink="http://schemas.microsoft.com/office/drawing/2016/ink" xmlns:am3d="http://schemas.microsoft.com/office/drawing/2017/model3d" xmlns:o="urn:schemas-microsoft-com:office:office" xmlns:r="http://schemas.openxmlformats.org/officeDocument/2006/relationships" xmlns:m="http://schemas.openxmlformats.org/officeDocument/2006/math" xmlns:v="urn:schemas-microsoft-com:vml" xmlns:wp14="http://schemas.microsoft.com/office/word/2010/wordprocessingDrawing" xmlns:wp="http://schemas.openxmlformats.org/drawingml/2006/wordprocessingDrawing" xmlns:w10="urn:schemas-microsoft-com:office:word" xmlns:w="http://schemas.openxmlformats.org/wordprocessingml/2006/main" xmlns:w14="http://schemas.microsoft.com/office/word/2010/wordml" xmlns:w15="http://schemas.microsoft.com/office/word/2012/wordml" xmlns:w16cex="http://schemas.microsoft.com/office/word/2018/wordml/cex" xmlns:w16cid="http://schemas.microsoft.com/office/word/2016/wordml/cid" xmlns:w16="http://schemas.microsoft.com/office/word/2018/wordml" xmlns:w16sdtdh="http://schemas.microsoft.com/office/word/2020/wordml/sdtdatahash" xmlns:w16se="http://schemas.microsoft.com/office/word/2015/wordml/symex" xmlns:wpg="http://schemas.microsoft.com/office/word/2010/wordprocessingGroup" xmlns:wpi="http://schemas.microsoft.com/office/word/2010/wordprocessingInk" xmlns:wne="http://schemas.microsoft.com/office/word/2006/wordml" xmlns:wps="http://schemas.microsoft.com/office/word/2010/wordprocessingShape" mc:Ignorable="w14 w15 w16se w16cid w16 w16cex w16sdtdh wp14">
+  <w:endnote w:type="separator" w:id="-1">
+    <w:p>
+      <w:pPr>
+        <w:spacing w:after="0" w:line="240" w:lineRule="auto"/>
+      </w:pPr>
+      <w:r>
+        <w:separator/>
+      </w:r>
+    </w:p>
+  </w:endnote>
+  <w:endnote w:type="continuationSeparator" w:id="0">
+    <w:p>
+      <w:pPr>
+        <w:spacing w:after="0" w:line="240" w:lineRule="auto"/>
+      </w:pPr>
+      <w:r>
+        <w:continuationSeparator/>
+      </w:r>
+    </w:p>
+  </w:endnote>
+</w:endnotes>
+</file>
+
+<file path=word/footnotes.xml><?xml version="1.0" encoding="utf-8"?>
+<w:footnotes xmlns:wpc="http://schemas.microsoft.com/office/word/2010/wordprocessingCanvas" xmlns:cx="http://schemas.microsoft.com/office/drawing/2014/chartex" xmlns:cx1="http://schemas.microsoft.com/office/drawing/2015/9/8/chartex" xmlns:cx2="http://schemas.microsoft.com/office/drawing/2015/10/21/chartex" xmlns:cx3="http://schemas.microsoft.com/office/drawing/2016/5/9/chartex" xmlns:cx4="http://schemas.microsoft.com/office/drawing/2016/5/10/chartex" xmlns:cx5="http://schemas.microsoft.com/office/drawing/2016/5/11/chartex" xmlns:cx6="http://schemas.microsoft.com/office/drawing/2016/5/12/chartex" xmlns:cx7="http://schemas.microsoft.com/office/drawing/2016/5/13/chartex" xmlns:cx8="http://schemas.microsoft.com/office/drawing/2016/5/14/chartex" xmlns:mc="http://schemas.openxmlformats.org/markup-compatibility/2006" xmlns:aink="http://schemas.microsoft.com/office/drawing/2016/ink" xmlns:am3d="http://schemas.microsoft.com/office/drawing/2017/model3d" xmlns:o="urn:schemas-microsoft-com:office:office" xmlns:r="http://schemas.openxmlformats.org/officeDocument/2006/relationships" xmlns:m="http://schemas.openxmlformats.org/officeDocument/2006/math" xmlns:v="urn:schemas-microsoft-com:vml" xmlns:wp14="http://schemas.microsoft.com/office/word/2010/wordprocessingDrawing" xmlns:wp="http://schemas.openxmlformats.org/drawingml/2006/wordprocessingDrawing" xmlns:w10="urn:schemas-microsoft-com:office:word" xmlns:w="http://schemas.openxmlformats.org/wordprocessingml/2006/main" xmlns:w14="http://schemas.microsoft.com/office/word/2010/wordml" xmlns:w15="http://schemas.microsoft.com/office/word/2012/wordml" xmlns:w16cex="http://schemas.microsoft.com/office/word/2018/wordml/cex" xmlns:w16cid="http://schemas.microsoft.com/office/word/2016/wordml/cid" xmlns:w16="http://schemas.microsoft.com/office/word/2018/wordml" xmlns:w16sdtdh="http://schemas.microsoft.com/office/word/2020/wordml/sdtdatahash" xmlns:w16se="http://schemas.microsoft.com/office/word/2015/wordml/symex" xmlns:wpg="http://schemas.microsoft.com/office/word/2010/wordprocessingGroup" xmlns:wpi="http://schemas.microsoft.com/office/word/2010/wordprocessingInk" xmlns:wne="http://schemas.microsoft.com/office/word/2006/wordml" xmlns:wps="http://schemas.microsoft.com/office/word/2010/wordprocessingShape" mc:Ignorable="w14 w15 w16se w16cid w16 w16cex w16sdtdh wp14">
+  <w:footnote w:type="separator" w:id="-1">
+    <w:p>
+      <w:pPr>
+        <w:spacing w:after="0" w:line="240" w:lineRule="auto"/>
+      </w:pPr>
+      <w:r>
+        <w:separator/>
+      </w:r>
+    </w:p>
+  </w:footnote>
+  <w:footnote w:type="continuationSeparator" w:id="0">
+    <w:p>
+      <w:pPr>
+        <w:spacing w:after="0" w:line="240" w:lineRule="auto"/>
+      </w:pPr>
+      <w:r>
+        <w:continuationSeparator/>
+      </w:r>
+    </w:p>
+  </w:footnote>
+</w:footnotes>
+</file>
+
+<file path=word/header1.xml><?xml version="1.0" encoding="utf-8"?>
+<w:hdr xmlns:wpc="http://schemas.microsoft.com/office/word/2010/wordprocessingCanvas" xmlns:cx="http://schemas.microsoft.com/office/drawing/2014/chartex" xmlns:cx1="http://schemas.microsoft.com/office/drawing/2015/9/8/chartex" xmlns:cx2="http://schemas.microsoft.com/office/drawing/2015/10/21/chartex" xmlns:cx3="http://schemas.microsoft.com/office/drawing/2016/5/9/chartex" xmlns:cx4="http://schemas.microsoft.com/office/drawing/2016/5/10/chartex" xmlns:cx5="http://schemas.microsoft.com/office/drawing/2016/5/11/chartex" xmlns:cx6="http://schemas.microsoft.com/office/drawing/2016/5/12/chartex" xmlns:cx7="http://schemas.microsoft.com/office/drawing/2016/5/13/chartex" xmlns:cx8="http://schemas.microsoft.com/office/drawing/2016/5/14/chartex" xmlns:mc="http://schemas.openxmlformats.org/markup-compatibility/2006" xmlns:aink="http://schemas.microsoft.com/office/drawing/2016/ink" xmlns:am3d="http://schemas.microsoft.com/office/drawing/2017/model3d" xmlns:o="urn:schemas-microsoft-com:office:office" xmlns:r="http://schemas.openxmlformats.org/officeDocument/2006/relationships" xmlns:m="http://schemas.openxmlformats.org/officeDocument/2006/math" xmlns:v="urn:schemas-microsoft-com:vml" xmlns:wp14="http://schemas.microsoft.com/office/word/2010/wordprocessingDrawing" xmlns:wp="http://schemas.openxmlformats.org/drawingml/2006/wordprocessingDrawing" xmlns:w10="urn:schemas-microsoft-com:office:word" xmlns:w="http://schemas.openxmlformats.org/wordprocessingml/2006/main" xmlns:w14="http://schemas.microsoft.com/office/word/2010/wordml" xmlns:w15="http://schemas.microsoft.com/office/word/2012/wordml" xmlns:w16cex="http://schemas.microsoft.com/office/word/2018/wordml/cex" xmlns:w16cid="http://schemas.microsoft.com/office/word/2016/wordml/cid" xmlns:w16="http://schemas.microsoft.com/office/word/2018/wordml" xmlns:w16sdtdh="http://schemas.microsoft.com/office/word/2020/wordml/sdtdatahash" xmlns:w16se="http://schemas.microsoft.com/office/word/2015/wordml/symex" xmlns:wpg="http://schemas.microsoft.com/office/word/2010/wordprocessingGroup" xmlns:wpi="http://schemas.microsoft.com/office/word/2010/wordprocessingInk" xmlns:wne="http://schemas.microsoft.com/office/word/2006/wordml" xmlns:wps="http://schemas.microsoft.com/office/word/2010/wordprocessingShape" mc:Ignorable="w14 w15 w16se w16cid w16 w16cex w16sdtdh wp14">
+  <w:p>
+    <w:pPr>
+      <w:tabs>
+        <w:tab w:val="left" w:pos="1260"/>
+      </w:tabs>
+      <w:overflowPunct w:val="0"/>
+      <w:autoSpaceDE w:val="0"/>
+      <w:autoSpaceDN w:val="0"/>
+      <w:adjustRightInd w:val="0"/>
+      <w:spacing w:after="0" w:line="240" w:lineRule="auto"/>
+      <w:jc w:val="center"/>
+      <w:textAlignment w:val="baseline"/>
+      <w:rPr>
+        <w:rFonts w:eastAsia="Times New Roman" w:cstheme="minorHAnsi"/>
+        <w:b/>
+        <w:sz w:val="28"/>
+        <w:szCs w:val="20"/>
+        <w:lang w:val="es-ES" w:eastAsia="es-ES"/>
+      </w:rPr>
+    </w:pPr>
+    <w:r>
+      <w:rPr>
+        <w:rFonts w:eastAsia="Times New Roman" w:cstheme="minorHAnsi"/>
+        <w:b/>
+        <w:noProof/>
+        <w:sz w:val="50"/>
+        <w:szCs w:val="20"/>
+        <w:lang w:val="es-MX" w:eastAsia="es-ES"/>
+      </w:rPr>
+      <w:drawing>
+        <wp:anchor distT="0" distB="0" distL="114300" distR="114300" simplePos="0" relativeHeight="251661312" behindDoc="1" locked="0" layoutInCell="1" allowOverlap="1" wp14:anchorId="0A96476A" wp14:editId="6A7FDD30">
+          <wp:simplePos x="0" y="0"/>
+          <wp:positionH relativeFrom="column">
+            <wp:posOffset>-832485</wp:posOffset>
+          </wp:positionH>
+          <wp:positionV relativeFrom="paragraph">
+            <wp:posOffset>-213995</wp:posOffset>
+          </wp:positionV>
+          <wp:extent cx="685800" cy="685800"/>
+          <wp:effectExtent l="0" t="0" r="0" b="0"/>
+          <wp:wrapTight wrapText="bothSides">
+            <wp:wrapPolygon edited="0">
+              <wp:start x="0" y="0"/>
+              <wp:lineTo x="0" y="21000"/>
+              <wp:lineTo x="21000" y="21000"/>
+              <wp:lineTo x="21000" y="0"/>
+              <wp:lineTo x="0" y="0"/>
+            </wp:wrapPolygon>
+          </wp:wrapTight>
+          <wp:docPr id="3" name="Imagen 3"/>
+          <wp:cNvGraphicFramePr>
+            <a:graphicFrameLocks xmlns:a="http://schemas.openxmlformats.org/drawingml/2006/main" noChangeAspect="1"/>
+          </wp:cNvGraphicFramePr>
+          <a:graphic xmlns:a="http://schemas.openxmlformats.org/drawingml/2006/main">
+            <a:graphicData uri="http://schemas.openxmlformats.org/drawingml/2006/picture">
+              <pic:pic xmlns:pic="http://schemas.openxmlformats.org/drawingml/2006/picture">
+                <pic:nvPicPr>
+                  <pic:cNvPr id="0" name="Picture 1"/>
+                  <pic:cNvPicPr>
+                    <a:picLocks noChangeAspect="1" noChangeArrowheads="1"/>
+                  </pic:cNvPicPr>
+                </pic:nvPicPr>
+                <pic:blipFill>
+                  <a:blip r:embed="rId1" cstate="print">
+                    <a:extLst>
+                      <a:ext uri="{28A0092B-C50C-407E-A947-70E740481C1C}">
+                        <a14:useLocalDpi xmlns:a14="http://schemas.microsoft.com/office/drawing/2010/main" val="0"/>
+                      </a:ext>
+                    </a:extLst>
+                  </a:blip>
+                  <a:srcRect/>
+                  <a:stretch>
+                    <a:fillRect/>
+                  </a:stretch>
+                </pic:blipFill>
+                <pic:spPr bwMode="auto">
+                  <a:xfrm>
+                    <a:off x="0" y="0"/>
+                    <a:ext cx="685800" cy="685800"/>
+                  </a:xfrm>
+                  <a:prstGeom prst="rect">
+                    <a:avLst/>
+                  </a:prstGeom>
+                  <a:noFill/>
+                  <a:ln>
+                    <a:noFill/>
+                  </a:ln>
+                </pic:spPr>
+              </pic:pic>
+            </a:graphicData>
+          </a:graphic>
+          <wp14:sizeRelH relativeFrom="page">
+            <wp14:pctWidth>0</wp14:pctWidth>
+          </wp14:sizeRelH>
+          <wp14:sizeRelV relativeFrom="page">
+            <wp14:pctHeight>0</wp14:pctHeight>
+          </wp14:sizeRelV>
+        </wp:anchor>
+      </w:drawing>
+    </w:r>
+    <w:r>
+      <w:rPr>
+        <w:rFonts w:eastAsia="Times New Roman" w:cstheme="minorHAnsi"/>
+        <w:b/>
+        <w:bCs/>
+        <w:sz w:val="28"/>
+        <w:szCs w:val="28"/>
+        <w:lang w:val="es-ES" w:eastAsia="es-ES"/>
+      </w:rPr>
+      <w:t>Universidad Nacional de La Matanza</w:t>
+    </w:r>
+  </w:p>
+  <w:p>
+    <w:pPr>
+      <w:tabs>
+        <w:tab w:val="center" w:pos="4252"/>
+        <w:tab w:val="right" w:pos="8504"/>
+      </w:tabs>
+      <w:overflowPunct w:val="0"/>
+      <w:autoSpaceDE w:val="0"/>
+      <w:autoSpaceDN w:val="0"/>
+      <w:adjustRightInd w:val="0"/>
+      <w:spacing w:after="0" w:line="240" w:lineRule="auto"/>
+      <w:textAlignment w:val="baseline"/>
+      <w:rPr>
+        <w:rFonts w:eastAsia="Times New Roman" w:cstheme="minorHAnsi"/>
+        <w:b/>
+        <w:sz w:val="32"/>
+        <w:szCs w:val="20"/>
+        <w:lang w:val="es-ES" w:eastAsia="es-ES"/>
+      </w:rPr>
+    </w:pPr>
+    <w:r>
+      <w:rPr>
+        <w:rFonts w:eastAsia="Times New Roman" w:cstheme="minorHAnsi"/>
+        <w:b/>
+        <w:bCs/>
+        <w:sz w:val="28"/>
+        <w:szCs w:val="28"/>
+        <w:lang w:val="es-ES" w:eastAsia="es-ES"/>
+      </w:rPr>
+      <w:tab/>
+    </w:r>
+    <w:r>
+      <w:rPr>
+        <w:rFonts w:eastAsia="Times New Roman" w:cstheme="minorHAnsi"/>
+        <w:b/>
+        <w:bCs/>
+        <w:sz w:val="28"/>
+        <w:szCs w:val="28"/>
+        <w:lang w:val="es-ES" w:eastAsia="es-ES"/>
+      </w:rPr>
+      <w:t>Departamento de Ingeniería e Investigaciones Tecnológicas</w:t>
+    </w:r>
+    <w:r>
+      <w:rPr>
+        <w:rFonts w:eastAsia="Times New Roman" w:cstheme="minorHAnsi"/>
+        <w:b/>
+        <w:bCs/>
+        <w:sz w:val="28"/>
+        <w:szCs w:val="28"/>
+        <w:lang w:val="es-ES" w:eastAsia="es-ES"/>
+      </w:rPr>
+      <w:tab/>
+    </w:r>
+  </w:p>
+  <w:p>
+    <w:pPr>
+      <w:pStyle w:val="Encabezado"/>
+    </w:pPr>
+  </w:p>
+</w:hdr>
+</file>
+
 <file path=word/numbering.xml><?xml version="1.0" encoding="utf-8"?>
 <w:numbering xmlns:wpc="http://schemas.microsoft.com/office/word/2010/wordprocessingCanvas" xmlns:cx="http://schemas.microsoft.com/office/drawing/2014/chartex" xmlns:cx1="http://schemas.microsoft.com/office/drawing/2015/9/8/chartex" xmlns:cx2="http://schemas.microsoft.com/office/drawing/2015/10/21/chartex" xmlns:cx3="http://schemas.microsoft.com/office/drawing/2016/5/9/chartex" xmlns:cx4="http://schemas.microsoft.com/office/drawing/2016/5/10/chartex" xmlns:cx5="http://schemas.microsoft.com/office/drawing/2016/5/11/chartex" xmlns:cx6="http://schemas.microsoft.com/office/drawing/2016/5/12/chartex" xmlns:cx7="http://schemas.microsoft.com/office/drawing/2016/5/13/chartex" xmlns:cx8="http://schemas.microsoft.com/office/drawing/2016/5/14/chartex" xmlns:mc="http://schemas.openxmlformats.org/markup-compatibility/2006" xmlns:aink="http://schemas.microsoft.com/office/drawing/2016/ink" xmlns:am3d="http://schemas.microsoft.com/office/drawing/2017/model3d" xmlns:o="urn:schemas-microsoft-com:office:office" xmlns:r="http://schemas.openxmlformats.org/officeDocument/2006/relationships" xmlns:m="http://schemas.openxmlformats.org/officeDocument/2006/math" xmlns:v="urn:schemas-microsoft-com:vml" xmlns:wp14="http://schemas.microsoft.com/office/word/2010/wordprocessingDrawing" xmlns:wp="http://schemas.openxmlformats.org/drawingml/2006/wordprocessingDrawing" xmlns:w10="urn:schemas-microsoft-com:office:word" xmlns:w="http://schemas.openxmlformats.org/wordprocessingml/2006/main" xmlns:w14="http://schemas.microsoft.com/office/word/2010/wordml" xmlns:w15="http://schemas.microsoft.com/office/word/2012/wordml" xmlns:w16cex="http://schemas.microsoft.com/office/word/2018/wordml/cex" xmlns:w16cid="http://schemas.microsoft.com/office/word/2016/wordml/cid" xmlns:w16="http://schemas.microsoft.com/office/word/2018/wordml" xmlns:w16sdtdh="http://schemas.microsoft.com/office/word/2020/wordml/sdtdatahash" xmlns:w16se="http://schemas.microsoft.com/office/word/2015/wordml/symex" xmlns:wpg="http://schemas.microsoft.com/office/word/2010/wordprocessingGroup" xmlns:wpi="http://schemas.microsoft.com/office/word/2010/wordprocessingInk" xmlns:wne="http://schemas.microsoft.com/office/word/2006/wordml" xmlns:wps="http://schemas.microsoft.com/office/word/2010/wordprocessingShape" mc:Ignorable="w14 w15 w16se w16cid w16 w16cex w16sdtdh wp14">
   <w:abstractNum w:abstractNumId="0" w15:restartNumberingAfterBreak="0">
@@ -1773,6 +2446,232 @@
     <w:nsid w:val="27A51261"/>
     <w:multiLevelType w:val="hybridMultilevel"/>
     <w:tmpl w:val="C2EEE07A"/>
+    <w:lvl w:ilvl="0" w:tplc="2C0A0003">
+      <w:start w:val="1"/>
+      <w:numFmt w:val="bullet"/>
+      <w:lvlText w:val="o"/>
+      <w:lvlJc w:val="left"/>
+      <w:pPr>
+        <w:ind w:left="1440" w:hanging="360"/>
+      </w:pPr>
+      <w:rPr>
+        <w:rFonts w:ascii="Courier New" w:hAnsi="Courier New" w:cs="Courier New" w:hint="default"/>
+      </w:rPr>
+    </w:lvl>
+    <w:lvl w:ilvl="1" w:tplc="2C0A0003" w:tentative="1">
+      <w:start w:val="1"/>
+      <w:numFmt w:val="bullet"/>
+      <w:lvlText w:val="o"/>
+      <w:lvlJc w:val="left"/>
+      <w:pPr>
+        <w:ind w:left="2160" w:hanging="360"/>
+      </w:pPr>
+      <w:rPr>
+        <w:rFonts w:ascii="Courier New" w:hAnsi="Courier New" w:cs="Courier New" w:hint="default"/>
+      </w:rPr>
+    </w:lvl>
+    <w:lvl w:ilvl="2" w:tplc="2C0A0005" w:tentative="1">
+      <w:start w:val="1"/>
+      <w:numFmt w:val="bullet"/>
+      <w:lvlText w:val=""/>
+      <w:lvlJc w:val="left"/>
+      <w:pPr>
+        <w:ind w:left="2880" w:hanging="360"/>
+      </w:pPr>
+      <w:rPr>
+        <w:rFonts w:ascii="Wingdings" w:hAnsi="Wingdings" w:hint="default"/>
+      </w:rPr>
+    </w:lvl>
+    <w:lvl w:ilvl="3" w:tplc="2C0A0001" w:tentative="1">
+      <w:start w:val="1"/>
+      <w:numFmt w:val="bullet"/>
+      <w:lvlText w:val=""/>
+      <w:lvlJc w:val="left"/>
+      <w:pPr>
+        <w:ind w:left="3600" w:hanging="360"/>
+      </w:pPr>
+      <w:rPr>
+        <w:rFonts w:ascii="Symbol" w:hAnsi="Symbol" w:hint="default"/>
+      </w:rPr>
+    </w:lvl>
+    <w:lvl w:ilvl="4" w:tplc="2C0A0003" w:tentative="1">
+      <w:start w:val="1"/>
+      <w:numFmt w:val="bullet"/>
+      <w:lvlText w:val="o"/>
+      <w:lvlJc w:val="left"/>
+      <w:pPr>
+        <w:ind w:left="4320" w:hanging="360"/>
+      </w:pPr>
+      <w:rPr>
+        <w:rFonts w:ascii="Courier New" w:hAnsi="Courier New" w:cs="Courier New" w:hint="default"/>
+      </w:rPr>
+    </w:lvl>
+    <w:lvl w:ilvl="5" w:tplc="2C0A0005" w:tentative="1">
+      <w:start w:val="1"/>
+      <w:numFmt w:val="bullet"/>
+      <w:lvlText w:val=""/>
+      <w:lvlJc w:val="left"/>
+      <w:pPr>
+        <w:ind w:left="5040" w:hanging="360"/>
+      </w:pPr>
+      <w:rPr>
+        <w:rFonts w:ascii="Wingdings" w:hAnsi="Wingdings" w:hint="default"/>
+      </w:rPr>
+    </w:lvl>
+    <w:lvl w:ilvl="6" w:tplc="2C0A0001" w:tentative="1">
+      <w:start w:val="1"/>
+      <w:numFmt w:val="bullet"/>
+      <w:lvlText w:val=""/>
+      <w:lvlJc w:val="left"/>
+      <w:pPr>
+        <w:ind w:left="5760" w:hanging="360"/>
+      </w:pPr>
+      <w:rPr>
+        <w:rFonts w:ascii="Symbol" w:hAnsi="Symbol" w:hint="default"/>
+      </w:rPr>
+    </w:lvl>
+    <w:lvl w:ilvl="7" w:tplc="2C0A0003" w:tentative="1">
+      <w:start w:val="1"/>
+      <w:numFmt w:val="bullet"/>
+      <w:lvlText w:val="o"/>
+      <w:lvlJc w:val="left"/>
+      <w:pPr>
+        <w:ind w:left="6480" w:hanging="360"/>
+      </w:pPr>
+      <w:rPr>
+        <w:rFonts w:ascii="Courier New" w:hAnsi="Courier New" w:cs="Courier New" w:hint="default"/>
+      </w:rPr>
+    </w:lvl>
+    <w:lvl w:ilvl="8" w:tplc="2C0A0005" w:tentative="1">
+      <w:start w:val="1"/>
+      <w:numFmt w:val="bullet"/>
+      <w:lvlText w:val=""/>
+      <w:lvlJc w:val="left"/>
+      <w:pPr>
+        <w:ind w:left="7200" w:hanging="360"/>
+      </w:pPr>
+      <w:rPr>
+        <w:rFonts w:ascii="Wingdings" w:hAnsi="Wingdings" w:hint="default"/>
+      </w:rPr>
+    </w:lvl>
+  </w:abstractNum>
+  <w:abstractNum w:abstractNumId="4" w15:restartNumberingAfterBreak="0">
+    <w:nsid w:val="42EB6F27"/>
+    <w:multiLevelType w:val="hybridMultilevel"/>
+    <w:tmpl w:val="D8C225F6"/>
+    <w:lvl w:ilvl="0" w:tplc="2C0A0003">
+      <w:start w:val="1"/>
+      <w:numFmt w:val="bullet"/>
+      <w:lvlText w:val="o"/>
+      <w:lvlJc w:val="left"/>
+      <w:pPr>
+        <w:ind w:left="1440" w:hanging="360"/>
+      </w:pPr>
+      <w:rPr>
+        <w:rFonts w:ascii="Courier New" w:hAnsi="Courier New" w:cs="Courier New" w:hint="default"/>
+      </w:rPr>
+    </w:lvl>
+    <w:lvl w:ilvl="1" w:tplc="2C0A0003" w:tentative="1">
+      <w:start w:val="1"/>
+      <w:numFmt w:val="bullet"/>
+      <w:lvlText w:val="o"/>
+      <w:lvlJc w:val="left"/>
+      <w:pPr>
+        <w:ind w:left="2160" w:hanging="360"/>
+      </w:pPr>
+      <w:rPr>
+        <w:rFonts w:ascii="Courier New" w:hAnsi="Courier New" w:cs="Courier New" w:hint="default"/>
+      </w:rPr>
+    </w:lvl>
+    <w:lvl w:ilvl="2" w:tplc="2C0A0005" w:tentative="1">
+      <w:start w:val="1"/>
+      <w:numFmt w:val="bullet"/>
+      <w:lvlText w:val=""/>
+      <w:lvlJc w:val="left"/>
+      <w:pPr>
+        <w:ind w:left="2880" w:hanging="360"/>
+      </w:pPr>
+      <w:rPr>
+        <w:rFonts w:ascii="Wingdings" w:hAnsi="Wingdings" w:hint="default"/>
+      </w:rPr>
+    </w:lvl>
+    <w:lvl w:ilvl="3" w:tplc="2C0A0001" w:tentative="1">
+      <w:start w:val="1"/>
+      <w:numFmt w:val="bullet"/>
+      <w:lvlText w:val=""/>
+      <w:lvlJc w:val="left"/>
+      <w:pPr>
+        <w:ind w:left="3600" w:hanging="360"/>
+      </w:pPr>
+      <w:rPr>
+        <w:rFonts w:ascii="Symbol" w:hAnsi="Symbol" w:hint="default"/>
+      </w:rPr>
+    </w:lvl>
+    <w:lvl w:ilvl="4" w:tplc="2C0A0003" w:tentative="1">
+      <w:start w:val="1"/>
+      <w:numFmt w:val="bullet"/>
+      <w:lvlText w:val="o"/>
+      <w:lvlJc w:val="left"/>
+      <w:pPr>
+        <w:ind w:left="4320" w:hanging="360"/>
+      </w:pPr>
+      <w:rPr>
+        <w:rFonts w:ascii="Courier New" w:hAnsi="Courier New" w:cs="Courier New" w:hint="default"/>
+      </w:rPr>
+    </w:lvl>
+    <w:lvl w:ilvl="5" w:tplc="2C0A0005" w:tentative="1">
+      <w:start w:val="1"/>
+      <w:numFmt w:val="bullet"/>
+      <w:lvlText w:val=""/>
+      <w:lvlJc w:val="left"/>
+      <w:pPr>
+        <w:ind w:left="5040" w:hanging="360"/>
+      </w:pPr>
+      <w:rPr>
+        <w:rFonts w:ascii="Wingdings" w:hAnsi="Wingdings" w:hint="default"/>
+      </w:rPr>
+    </w:lvl>
+    <w:lvl w:ilvl="6" w:tplc="2C0A0001" w:tentative="1">
+      <w:start w:val="1"/>
+      <w:numFmt w:val="bullet"/>
+      <w:lvlText w:val=""/>
+      <w:lvlJc w:val="left"/>
+      <w:pPr>
+        <w:ind w:left="5760" w:hanging="360"/>
+      </w:pPr>
+      <w:rPr>
+        <w:rFonts w:ascii="Symbol" w:hAnsi="Symbol" w:hint="default"/>
+      </w:rPr>
+    </w:lvl>
+    <w:lvl w:ilvl="7" w:tplc="2C0A0003" w:tentative="1">
+      <w:start w:val="1"/>
+      <w:numFmt w:val="bullet"/>
+      <w:lvlText w:val="o"/>
+      <w:lvlJc w:val="left"/>
+      <w:pPr>
+        <w:ind w:left="6480" w:hanging="360"/>
+      </w:pPr>
+      <w:rPr>
+        <w:rFonts w:ascii="Courier New" w:hAnsi="Courier New" w:cs="Courier New" w:hint="default"/>
+      </w:rPr>
+    </w:lvl>
+    <w:lvl w:ilvl="8" w:tplc="2C0A0005" w:tentative="1">
+      <w:start w:val="1"/>
+      <w:numFmt w:val="bullet"/>
+      <w:lvlText w:val=""/>
+      <w:lvlJc w:val="left"/>
+      <w:pPr>
+        <w:ind w:left="7200" w:hanging="360"/>
+      </w:pPr>
+      <w:rPr>
+        <w:rFonts w:ascii="Wingdings" w:hAnsi="Wingdings" w:hint="default"/>
+      </w:rPr>
+    </w:lvl>
+  </w:abstractNum>
+  <w:abstractNum w:abstractNumId="5" w15:restartNumberingAfterBreak="0">
+    <w:nsid w:val="4B7F1DD6"/>
+    <w:multiLevelType w:val="hybridMultilevel"/>
+    <w:tmpl w:val="7FD21AF8"/>
     <w:lvl w:ilvl="0" w:tplc="2C0A0003">
       <w:start w:val="1"/>
       <w:numFmt w:val="bullet"/>
@@ -1893,6 +2792,12 @@
   </w:num>
   <w:num w:numId="4">
     <w:abstractNumId w:val="0"/>
+  </w:num>
+  <w:num w:numId="5">
+    <w:abstractNumId w:val="5"/>
+  </w:num>
+  <w:num w:numId="6">
+    <w:abstractNumId w:val="4"/>
   </w:num>
 </w:numbering>
 </file>
@@ -2334,15 +3239,93 @@
       <w:contextualSpacing/>
     </w:pPr>
   </w:style>
+  <w:style w:type="paragraph" w:styleId="Ttulo">
+    <w:name w:val="Title"/>
+    <w:basedOn w:val="Normal"/>
+    <w:next w:val="Normal"/>
+    <w:link w:val="TtuloCar"/>
+    <w:uiPriority w:val="10"/>
+    <w:qFormat/>
+    <w:rsid w:val="00F4084F"/>
+    <w:pPr>
+      <w:spacing w:after="0" w:line="240" w:lineRule="auto"/>
+      <w:contextualSpacing/>
+    </w:pPr>
+    <w:rPr>
+      <w:rFonts w:asciiTheme="majorHAnsi" w:eastAsiaTheme="majorEastAsia" w:hAnsiTheme="majorHAnsi" w:cstheme="majorBidi"/>
+      <w:spacing w:val="-10"/>
+      <w:kern w:val="28"/>
+      <w:sz w:val="56"/>
+      <w:szCs w:val="56"/>
+    </w:rPr>
+  </w:style>
+  <w:style w:type="character" w:customStyle="1" w:styleId="TtuloCar">
+    <w:name w:val="Título Car"/>
+    <w:basedOn w:val="Fuentedeprrafopredeter"/>
+    <w:link w:val="Ttulo"/>
+    <w:uiPriority w:val="10"/>
+    <w:rsid w:val="00F4084F"/>
+    <w:rPr>
+      <w:rFonts w:asciiTheme="majorHAnsi" w:eastAsiaTheme="majorEastAsia" w:hAnsiTheme="majorHAnsi" w:cstheme="majorBidi"/>
+      <w:spacing w:val="-10"/>
+      <w:kern w:val="28"/>
+      <w:sz w:val="56"/>
+      <w:szCs w:val="56"/>
+    </w:rPr>
+  </w:style>
+  <w:style w:type="paragraph" w:styleId="Encabezado">
+    <w:name w:val="header"/>
+    <w:basedOn w:val="Normal"/>
+    <w:link w:val="EncabezadoCar"/>
+    <w:uiPriority w:val="99"/>
+    <w:unhideWhenUsed/>
+    <w:rsid w:val="00331A96"/>
+    <w:pPr>
+      <w:tabs>
+        <w:tab w:val="center" w:pos="4252"/>
+        <w:tab w:val="right" w:pos="8504"/>
+      </w:tabs>
+      <w:spacing w:after="0" w:line="240" w:lineRule="auto"/>
+    </w:pPr>
+  </w:style>
+  <w:style w:type="character" w:customStyle="1" w:styleId="EncabezadoCar">
+    <w:name w:val="Encabezado Car"/>
+    <w:basedOn w:val="Fuentedeprrafopredeter"/>
+    <w:link w:val="Encabezado"/>
+    <w:uiPriority w:val="99"/>
+    <w:rsid w:val="00331A96"/>
+  </w:style>
+  <w:style w:type="paragraph" w:styleId="Piedepgina">
+    <w:name w:val="footer"/>
+    <w:basedOn w:val="Normal"/>
+    <w:link w:val="PiedepginaCar"/>
+    <w:uiPriority w:val="99"/>
+    <w:unhideWhenUsed/>
+    <w:rsid w:val="00331A96"/>
+    <w:pPr>
+      <w:tabs>
+        <w:tab w:val="center" w:pos="4252"/>
+        <w:tab w:val="right" w:pos="8504"/>
+      </w:tabs>
+      <w:spacing w:after="0" w:line="240" w:lineRule="auto"/>
+    </w:pPr>
+  </w:style>
+  <w:style w:type="character" w:customStyle="1" w:styleId="PiedepginaCar">
+    <w:name w:val="Pie de página Car"/>
+    <w:basedOn w:val="Fuentedeprrafopredeter"/>
+    <w:link w:val="Piedepgina"/>
+    <w:uiPriority w:val="99"/>
+    <w:rsid w:val="00331A96"/>
+  </w:style>
 </w:styles>
 </file>
 
 <file path=word/theme/theme1.xml><?xml version="1.0" encoding="utf-8"?>
 <a:theme xmlns:a="http://schemas.openxmlformats.org/drawingml/2006/main" name="Tema de Office">
   <a:themeElements>
-    <a:clrScheme name="Office">
+    <a:clrScheme name="Personalizado 1">
       <a:dk1>
-        <a:sysClr val="windowText" lastClr="000000"/>
+        <a:srgbClr val="A5A5A5"/>
       </a:dk1>
       <a:lt1>
         <a:sysClr val="window" lastClr="FFFFFF"/>

</xml_diff>